<commit_message>
Thesis Chapter 5: aims of the prototype, dataset and consent-creation steps added under the prototype section
Co-Authored-By: Claude Fable 5.1 <noreply@anthropic.com>
Claude-Session: https://claude.ai/code/session_01QHSSv245Aernyaebt7V5kS
</commit_message>
<xml_diff>
--- a/docs/Yasir_Thesis_Chapter5.docx
+++ b/docs/Yasir_Thesis_Chapter5.docx
@@ -104,7 +104,7 @@
         <w:rPr>
           <w:color w:val="FF0000"/>
         </w:rPr>
-        <w:t>Sections 5.2 to 5.4 present the architecture: its three layers and their components, where trust is evaluated and where the boundaries between the layers lie, and how the architecture maps to the six research objectives. Section 5.5 presents the consent model: the creation workflow, the structure of the consent object C = (I, A, P, T, L, E), and the creation procedure as Algorithm 1. Section 5.6 shows how the model is implemented in the HALAH prototype. Section 5.7 validates the consent creation against the live scenarios, the automated tests and the audit ledger, and evaluates the architecture against the security properties it is designed to provide. Section 5.8 concludes the chapter.</w:t>
+        <w:t>Sections 5.2 to 5.4 present the architecture: its three layers and their components, where trust is evaluated and where the boundaries between the layers lie, and how the architecture maps to the six research objectives. Section 5.5 presents the consent model: the creation workflow, the structure of the consent object C = (I, A, P, T, L, E), and the creation procedure as Algorithm 1. Section 5.6 shows how the model is implemented in the HALAH prototype: the aims of the prototype, the dataset it uses and the steps of consent creation. Section 5.7 validates the consent creation against the live scenarios, the automated tests and the audit ledger, and evaluates the architecture against the security properties it is designed to provide. Section 5.8 concludes the chapter.</w:t>
       </w:r>
     </w:p>
     <w:p>
@@ -3955,12 +3955,128 @@
       </w:r>
     </w:p>
     <w:p>
+      <w:pPr>
+        <w:pStyle w:val="3"/>
+      </w:pPr>
+      <w:r>
+        <w:rPr>
+          <w:color w:val="FF0000"/>
+        </w:rPr>
+        <w:t>5.6.1 Aims of Engineering the Prototype System</w:t>
+      </w:r>
+    </w:p>
+    <w:p>
       <w:pPr/>
       <w:r>
         <w:rPr>
           <w:color w:val="FF0000"/>
         </w:rPr>
-        <w:t>Figure 5.7 shows the patient interface of the prototype at the moment a consent is created. The patient selects their own DID from the loaded record set, enters the DID of the authorised doctor and the DIDs of the guardians, chooses the data modules from the four EMR modules, and sets the start and expiry times. When the patient submits the form, the interface runs the checks of Algorithm 1 and, if they pass, shows the identifier of the new consent and confirms that the creation was logged. The consent then appears in the patient's list in the state PENDING_SIGNATURE with no approvals, which is the state defined in Section 5.5.1. The guardians, the doctor and the auditor each use their own interface, presented in the chapters that follow.</w:t>
+        <w:t>The prototype was engineered for three aims. The first is to show that the consent model can be built: a patient can create the object C = (I, A, P, T, L, E) through an interface, and the object carries every component that the later checks need. The second is to make the design testable: the same code that the interface calls is called by the automated tests, so a check that the interface enforces can also be attacked directly at the service level, which is how the gaps closed by the hardening of 1 October 2026 were found. The third is to produce evidence: every creation, approval, decision and revocation is written to the audit ledger with the result of each check, so the claims of this and the following chapters can be traced to recorded events rather than to screenshots alone. The prototype is not engineered for throughput or for a production deployment; its purpose is to validate the design.</w:t>
+      </w:r>
+    </w:p>
+    <w:p>
+      <w:pPr>
+        <w:pStyle w:val="3"/>
+      </w:pPr>
+      <w:r>
+        <w:t>5.6.2 Dataset Used for Validation</w:t>
+      </w:r>
+    </w:p>
+    <w:p>
+      <w:pPr>
+        <w:spacing w:after="110" w:line="264" w:lineRule="auto"/>
+        <w:jc w:val="both"/>
+      </w:pPr>
+      <w:r>
+        <w:t>The prototype uses synthetic patient records from the Synthea 1K sample (Walonoski et al. 2018), taken from synthea.mitre.org in its CSV export rather than its FHIR R4 export (HL7 International 2019). Synthea generates realistic but artificial patients, so no real patient data is involved.</w:t>
+      </w:r>
+      <w:r>
+        <w:rPr/>
+        <w:t xml:space="preserve"> The Synthea 1K sample is a public synthetic healthcare dataset of 1,000 simulated patient records, with patient demographics, medical conditions, medications and procedures in CSV files.</w:t>
+      </w:r>
+      <w:r>
+        <w:t xml:space="preserve"> The prototype loads a subset of patients together with their conditions, observations, medications and procedures, and these tables provide the healthcare data modules that a consent can authorise, such as Observation, Medication and Procedure. The records are used only to construct representative consent workflows</w:t>
+      </w:r>
+      <w:r>
+        <w:rPr/>
+        <w:t xml:space="preserve"> and the healthcare data-access scenarios used to test the prototype</w:t>
+      </w:r>
+      <w:r>
+        <w:t>. The authorisation decisions do not depend on the clinical content, and no medical content is written to the chain. The records are not changed. The only step is the selection of the subset loaded into the local database of the prototype.</w:t>
+      </w:r>
+    </w:p>
+    <w:p>
+      <w:pPr>
+        <w:pStyle w:val="3"/>
+      </w:pPr>
+      <w:r>
+        <w:rPr>
+          <w:color w:val="FF0000"/>
+        </w:rPr>
+        <w:t>5.6.3 Steps in the Working of the Prototype for Consent Creation</w:t>
+      </w:r>
+    </w:p>
+    <w:p>
+      <w:pPr/>
+      <w:r>
+        <w:rPr>
+          <w:color w:val="FF0000"/>
+        </w:rPr>
+        <w:t>The creation of a consent in the prototype follows the steps of Algorithm 1 as shown in Figure 5.7:</w:t>
+      </w:r>
+    </w:p>
+    <w:p>
+      <w:pPr/>
+      <w:r>
+        <w:rPr>
+          <w:color w:val="FF0000"/>
+        </w:rPr>
+        <w:t>1. The patient selects the role Patient and their own DID, which the prototype loads from the record set.</w:t>
+      </w:r>
+    </w:p>
+    <w:p>
+      <w:pPr/>
+      <w:r>
+        <w:rPr>
+          <w:color w:val="FF0000"/>
+        </w:rPr>
+        <w:t>2. The patient enters the DID of the authorised doctor and the DIDs of the guardians, separated by commas.</w:t>
+      </w:r>
+    </w:p>
+    <w:p>
+      <w:pPr/>
+      <w:r>
+        <w:rPr>
+          <w:color w:val="FF0000"/>
+        </w:rPr>
+        <w:t>3. The patient selects the data modules from Observation, Medication, Condition and Procedure, and sets the start and expiry times.</w:t>
+      </w:r>
+    </w:p>
+    <w:p>
+      <w:pPr/>
+      <w:r>
+        <w:rPr>
+          <w:color w:val="FF0000"/>
+        </w:rPr>
+        <w:t>4. The patient presses Initial Consent. The prototype checks that the doctor DID holds a valid doctor credential, that each guardian DID holds a valid guardian credential, that no guardian appears twice, that the data scope is not empty and that the expiry time is later than the start time. If any check fails, an error message names the failed field and nothing is stored.</w:t>
+      </w:r>
+    </w:p>
+    <w:p>
+      <w:pPr/>
+      <w:r>
+        <w:rPr>
+          <w:color w:val="FF0000"/>
+        </w:rPr>
+        <w:t>5. If every check passes, the prototype assigns the consent identifier, stores the object in the state PENDING_SIGNATURE with N set to the number of guardians, writes the CREATE_CONSENT event to the audit ledger, and shows the identifier to the patient.</w:t>
+      </w:r>
+    </w:p>
+    <w:p>
+      <w:pPr/>
+      <w:r>
+        <w:rPr>
+          <w:color w:val="FF0000"/>
+        </w:rPr>
+        <w:t>6. The new consent appears in the patient's list with 0 of N approvals, where it waits for the guardians, whose steps are presented in Chapter 7.</w:t>
       </w:r>
     </w:p>
     <w:p>

</xml_diff>

<commit_message>
Thesis Chapter 5: the twelve creation steps of the original report restored before Algorithm 1
Co-Authored-By: Claude Fable 5.1 <noreply@anthropic.com>
Claude-Session: https://claude.ai/code/session_01QHSSv245Aernyaebt7V5kS
</commit_message>
<xml_diff>
--- a/docs/Yasir_Thesis_Chapter5.docx
+++ b/docs/Yasir_Thesis_Chapter5.docx
@@ -2941,140 +2941,207 @@
       </w:r>
     </w:p>
     <w:p>
-      <w:pPr>
-        <w:spacing w:after="110" w:line="264" w:lineRule="auto"/>
-        <w:jc w:val="both"/>
-      </w:pPr>
-      <w:r>
-        <w:t>The procedure establishes a valid and auditable consent object by sequentially validating the participating entities, consent purpose, data scope, and temporal constraints. The system first validates the patient's identity I</w:t>
-      </w:r>
-      <w:r>
-        <w:rPr>
-          <w:vertAlign w:val="subscript"/>
-        </w:rPr>
-        <w:t>p</w:t>
-      </w:r>
-      <w:r>
-        <w:t>. If I</w:t>
-      </w:r>
-      <w:r>
-        <w:rPr>
-          <w:vertAlign w:val="subscript"/>
-        </w:rPr>
-        <w:t>p</w:t>
-      </w:r>
-      <w:r>
-        <w:t xml:space="preserve"> cannot be successfully validated, the procedure terminates immediately and returns REJECT. The system validates the designated doctor D, whose DID must hold a valid doctor credential. The system then validates the guardian set G, which must be non-empty, and every guardian in it must have a well-formed DID that holds a valid guardian credential. This step prevents an arbitrary third party from being treated as an authorised representative of the patient. The intended data-use purpose P</w:t>
-      </w:r>
-      <w:r>
-        <w:rPr>
-          <w:vertAlign w:val="subscript"/>
-        </w:rPr>
-        <w:t>u</w:t>
-      </w:r>
-      <w:r>
-        <w:t xml:space="preserve"> is validated and bound to the consent object so that authorisation is not interpreted as unrestricted access to the patient's healthcare information. The authorised data scope S</w:t>
-      </w:r>
-      <w:r>
-        <w:rPr>
-          <w:vertAlign w:val="subscript"/>
-        </w:rPr>
-        <w:t>C</w:t>
-      </w:r>
-      <w:r>
-        <w:t xml:space="preserve"> is validated to determine precisely which healthcare resources may be accessed under the consent. The scope may represent specific resource categories, such as observations, medications, conditions, or procedures, which are the modules used in the prototype. This step establishes the principle of least privilege by ensuring that consent is associated with explicitly defined data resources rather than the patient's entire healthcare record. If any of D, G, P</w:t>
-      </w:r>
-      <w:r>
-        <w:rPr>
-          <w:vertAlign w:val="subscript"/>
-        </w:rPr>
-        <w:t>u</w:t>
-      </w:r>
-      <w:r>
-        <w:t xml:space="preserve"> or S</w:t>
-      </w:r>
-      <w:r>
-        <w:rPr>
-          <w:vertAlign w:val="subscript"/>
-        </w:rPr>
-        <w:t>C</w:t>
-      </w:r>
-      <w:r>
-        <w:t xml:space="preserve"> is invalid, the consent request is rejected and no consent is created.</w:t>
-      </w:r>
-    </w:p>
-    <w:p>
-      <w:pPr>
-        <w:spacing w:after="110" w:line="264" w:lineRule="auto"/>
-        <w:jc w:val="both"/>
-      </w:pPr>
-      <w:r>
-        <w:t xml:space="preserve">The system verifies that the interval is logically valid by requiring t</w:t>
-      </w:r>
-      <w:r>
-        <w:rPr>
-          <w:vertAlign w:val="subscript"/>
-        </w:rPr>
-        <w:t>e</w:t>
-      </w:r>
-      <w:r>
-        <w:t xml:space="preserve"> &gt; t</w:t>
-      </w:r>
-      <w:r>
-        <w:rPr>
-          <w:vertAlign w:val="subscript"/>
-        </w:rPr>
-        <w:t>s</w:t>
-      </w:r>
-      <w:r>
-        <w:t xml:space="preserve">. If this condition is not satisfied, the consent request is rejected. After all input elements have been validated, the system defines the authorisation requirement A. This requirement specifies the conditions that must subsequently be satisfied before access can be granted. The system generates a unique consent identifier id</w:t>
-      </w:r>
-      <w:r>
-        <w:rPr>
-          <w:vertAlign w:val="subscript"/>
-        </w:rPr>
-        <w:t>C</w:t>
-      </w:r>
-      <w:r>
-        <w:t xml:space="preserve">. This identifier provides a persistent reference to the consent object and enables subsequent operations, including consent verification, access authorisation, modification, revocation, and audit. Possession of the identifier alone grants no access, because every subsequent request is evaluated by the complete decision rule. The smart contract assigns the on-chain token identifier separately, only when the consent is activated. The constructed consent object C is persisted, and finally the system records evidence </w:t>
-        <w:lastRenderedPageBreak/>
-        <w:t>associated with the creation event. The overall procedure can therefore be represented as a sequential trust establishment process that I</w:t>
-      </w:r>
-      <w:r>
-        <w:rPr>
-          <w:vertAlign w:val="subscript"/>
-        </w:rPr>
-        <w:t>p</w:t>
-      </w:r>
-      <w:r>
-        <w:t xml:space="preserve"> → D → G → P</w:t>
-      </w:r>
-      <w:r>
-        <w:rPr>
-          <w:vertAlign w:val="subscript"/>
-        </w:rPr>
-        <w:t>u</w:t>
-      </w:r>
-      <w:r>
-        <w:t xml:space="preserve"> → S</w:t>
-      </w:r>
-      <w:r>
-        <w:rPr>
-          <w:vertAlign w:val="subscript"/>
-        </w:rPr>
-        <w:t>C</w:t>
-      </w:r>
-      <w:r>
-        <w:t xml:space="preserve"> → T → A → id</w:t>
-      </w:r>
-      <w:r>
-        <w:rPr>
-          <w:vertAlign w:val="subscript"/>
-        </w:rPr>
-        <w:t>C</w:t>
-      </w:r>
-      <w:r>
-        <w:t xml:space="preserve"> → C → E. Consent is therefore created only after the identity, authority, purpose, scope, and temporal fields have been validated.</w:t>
+      <w:pPr/>
+      <w:r>
+        <w:t>The Trust-Aware Consent Creation procedure establishes a valid and auditable consent object by sequentially validating the participating entities, consent purpose, data scope, and temporal constraints before the consent is persisted. The procedure consists of the following steps.</w:t>
+      </w:r>
+    </w:p>
+    <w:p>
+      <w:pPr>
+        <w:pStyle w:val="a4"/>
+      </w:pPr>
+      <w:r>
+        <w:rPr>
+          <w:b/>
+        </w:rPr>
+        <w:t xml:space="preserve">Step 1 – Validate Patient Identity. </w:t>
+      </w:r>
+      <w:r>
+        <w:t>The system first validates the patient’s identity Ip. The identity is checked against the available identity and credential verification mechanisms to ensure that the consent request originates from a recognised patient entity. If Ip cannot be successfully validated, the procedure terminates immediately and returns REJECT.</w:t>
+      </w:r>
+    </w:p>
+    <w:p>
+      <w:pPr>
+        <w:pStyle w:val="a4"/>
+      </w:pPr>
+      <w:r>
+        <w:rPr>
+          <w:b/>
+        </w:rPr>
+        <w:t xml:space="preserve">Step 2 – Validate the Authorised Doctor. </w:t>
+      </w:r>
+      <w:r>
+        <w:t>The system validates the identity and authorisation status of the designated doctor D. This step determines whether the doctor is a recognised healthcare participant and whether the presented credentials are sufficient for participation in the requested consent relationship. An invalid or unauthorised doctor results in rejection of the consent request.</w:t>
+      </w:r>
+    </w:p>
+    <w:p>
+      <w:pPr>
+        <w:pStyle w:val="a4"/>
+      </w:pPr>
+      <w:r>
+        <w:rPr>
+          <w:b/>
+        </w:rPr>
+        <w:t xml:space="preserve">Step 3 – Validate Guardian or Proxy Participants. </w:t>
+      </w:r>
+      <w:r>
+        <w:t>If a guardian or proxy is specified, the system validates the guardian set G. Each guardian is checked to determine whether the individual or entity possesses the required authority to participate in consent-related decisions. This step prevents an arbitrary third party from being treated as an authorised representative of the patient.</w:t>
+      </w:r>
+    </w:p>
+    <w:p>
+      <w:pPr>
+        <w:pStyle w:val="a4"/>
+      </w:pPr>
+      <w:r>
+        <w:rPr>
+          <w:b/>
+        </w:rPr>
+        <w:t xml:space="preserve">Step 4 – Validate the Intended Purpose. </w:t>
+      </w:r>
+      <w:r>
+        <w:t>The intended data-use purpose Pu is validated to ensure that the purpose is explicitly specified and conforms to the supported healthcare-use policies. The purpose is subsequently bound to the consent object so that authorisation is not interpreted as unrestricted access to the patient’s healthcare information.</w:t>
+      </w:r>
+    </w:p>
+    <w:p>
+      <w:pPr>
+        <w:pStyle w:val="a4"/>
+      </w:pPr>
+      <w:r>
+        <w:rPr>
+          <w:b/>
+        </w:rPr>
+        <w:t xml:space="preserve">Step 5 – Validate the Data Scope. </w:t>
+      </w:r>
+      <w:r>
+        <w:t>The requested data scope SC is validated to determine precisely which healthcare resources may be accessed under the consent. The scope may represent specific resource categories, such as observations, medications, procedures, or other FHIR resources. This step establishes the principle of least privilege by ensuring that consent is associated with explicitly defined data resources rather than the patient’s entire healthcare record.</w:t>
+      </w:r>
+    </w:p>
+    <w:p>
+      <w:pPr>
+        <w:pStyle w:val="a4"/>
+      </w:pPr>
+      <w:r>
+        <w:rPr>
+          <w:b/>
+        </w:rPr>
+        <w:t xml:space="preserve">Step 6 – Validate the Consent Validity Interval. </w:t>
+      </w:r>
+      <w:r>
+        <w:t>The system validates the temporal validity interval T = (ts, te), where ts represents the consent start time and te represents the expiration time. The system verifies that the interval is logically valid by requiring te &gt; ts. If this condition is not satisfied, the consent request is rejected.</w:t>
+      </w:r>
+    </w:p>
+    <w:p>
+      <w:pPr>
+        <w:pStyle w:val="a4"/>
+      </w:pPr>
+      <w:r>
+        <w:rPr>
+          <w:b/>
+        </w:rPr>
+        <w:t xml:space="preserve">Step 7 – Define the Authorisation Requirement. </w:t>
+      </w:r>
+      <w:r>
+        <w:t>After all input elements have been validated, the system defines the authorisation requirement A. This requirement specifies the conditions that must subsequently be satisfied before access can be granted. Depending on the system configuration, A may incorporate patient approval, guardian approval, doctor authority, role requirements, multi-party approval, scope restrictions, purpose restrictions, and temporal constraints.</w:t>
+      </w:r>
+    </w:p>
+    <w:p>
+      <w:pPr>
+        <w:pStyle w:val="a4"/>
+      </w:pPr>
+      <w:r>
+        <w:rPr>
+          <w:b/>
+        </w:rPr>
+        <w:t xml:space="preserve">Step 8 – Generate a Unique Consent Identifier. </w:t>
+      </w:r>
+      <w:r>
+        <w:t>The system generates a unique consent identifier idC. This identifier provides a persistent reference to the consent object and enables subsequent operations, including consent verification, access authorisation, modification, revocation, and audit.</w:t>
+      </w:r>
+    </w:p>
+    <w:p>
+      <w:pPr>
+        <w:pStyle w:val="a4"/>
+      </w:pPr>
+      <w:r>
+        <w:rPr>
+          <w:b/>
+        </w:rPr>
+        <w:t xml:space="preserve">Step 9 – Construct the Consent Object. </w:t>
+      </w:r>
+      <w:r>
+        <w:t xml:space="preserve">The validated information is combined to construct the consent object C = (I, A, P, </w:t>
+      </w:r>
+      <w:r>
+        <w:rPr>
+          <w:color w:val="FF0000"/>
+        </w:rPr>
+        <w:t xml:space="preserve">T, L, </w:t>
+      </w:r>
+      <w:r>
+        <w:t xml:space="preserve">E), where I represents the verified identity information, A represents the authorisation requirements, P represents the consent purpose and associated permissions, </w:t>
+      </w:r>
+      <w:r>
+        <w:rPr>
+          <w:color w:val="FF0000"/>
+        </w:rPr>
+        <w:t xml:space="preserve">T represents the validity interval, L represents the lifecycle state, </w:t>
+      </w:r>
+      <w:r>
+        <w:t>and E represents the evidence associated with the consent decision. The resulting object therefore captures not only the patient’s preference but also the evidence required to support subsequent authorisation decisions.</w:t>
+      </w:r>
+    </w:p>
+    <w:p>
+      <w:pPr>
+        <w:pStyle w:val="a4"/>
+      </w:pPr>
+      <w:r>
+        <w:rPr>
+          <w:b/>
+        </w:rPr>
+        <w:t xml:space="preserve">Step 10 – Persist the Consent Object. </w:t>
+      </w:r>
+      <w:r>
+        <w:t>The constructed consent object C is persisted in the consent-management infrastructure. The persistence mechanism provides a stable representation of the consent state that can subsequently be referenced by the access-control and authorisation components.</w:t>
+      </w:r>
+    </w:p>
+    <w:p>
+      <w:pPr>
+        <w:pStyle w:val="a4"/>
+      </w:pPr>
+      <w:r>
+        <w:rPr>
+          <w:b/>
+        </w:rPr>
+        <w:t xml:space="preserve">Step 11 – Record Consent Creation Evidence. </w:t>
+      </w:r>
+      <w:r>
+        <w:t>Finally, the system records evidence associated with the creation event, including the consent identifier, participating entities, relevant timestamps, and the resulting consent state. This evidence provides an auditable record that can be used to reconstruct and verify the consent lifecycle.</w:t>
+      </w:r>
+    </w:p>
+    <w:p>
+      <w:pPr>
+        <w:pStyle w:val="a4"/>
+      </w:pPr>
+      <w:r>
+        <w:rPr>
+          <w:b/>
+        </w:rPr>
+        <w:t xml:space="preserve">Step 12 – Return the Consent Result. </w:t>
+      </w:r>
+      <w:r>
+        <w:t>If all validation and construction operations are completed successfully, the system returns the newly created consent object C. If any mandatory validation fails during the process, the system terminates the procedure and returns REJECT.</w:t>
+      </w:r>
+    </w:p>
+    <w:p>
+      <w:pPr/>
+      <w:r>
+        <w:t>The overall procedure can therefore be represented as a sequential trust establishment process that Ip → D → G → Pu → SC → T → A → idC → C → E.</w:t>
+      </w:r>
+    </w:p>
+    <w:p>
+      <w:pPr/>
+      <w:r>
+        <w:t>This sequence ensures that consent is created only after the relevant identity, authority, purpose, scope, and temporal constraints have been validated. Consequently, the resulting consent object serves not merely as a record of patient preference, but as a structured authorisation artefact that can provide evidence for subsequent healthcare data-access decisions.</w:t>
       </w:r>
     </w:p>
     <w:p>

</xml_diff>

<commit_message>
Thesis Chapter 5: Table 5.3 evaluates the consent model by component; security table becomes Table 5.4
Co-Authored-By: Claude Fable 5.1 <noreply@anthropic.com>
Claude-Session: https://claude.ai/code/session_01QHSSv245Aernyaebt7V5kS
</commit_message>
<xml_diff>
--- a/docs/Yasir_Thesis_Chapter5.docx
+++ b/docs/Yasir_Thesis_Chapter5.docx
@@ -4309,32 +4309,12 @@
       </w:r>
     </w:p>
     <w:p>
-      <w:pPr>
-        <w:pStyle w:val="3"/>
-      </w:pPr>
+      <w:pPr/>
       <w:r>
         <w:rPr>
           <w:color w:val="FF0000"/>
         </w:rPr>
-        <w:t>5.7.2 Evaluation of the Architecture against the Security Properties</w:t>
-      </w:r>
-    </w:p>
-    <w:p>
-      <w:pPr/>
-      <w:r>
-        <w:rPr>
-          <w:color w:val="FF0000"/>
-        </w:rPr>
-        <w:t>The proposed MVC architecture provides several foundational security properties for the current stage. These properties emerge from the interaction between the Model, View, and Controller rather than from any single technology.</w:t>
-      </w:r>
-    </w:p>
-    <w:p>
-      <w:pPr/>
-      <w:r>
-        <w:rPr>
-          <w:color w:val="FF0000"/>
-        </w:rPr>
-        <w:t>First, the architecture provides identity-dependent participation. A participant cannot contribute to the authorisation process solely by interacting with the system interface. The corresponding identity and credential must satisfy the verification requirements. Second, the architecture provides authority separation. Possession of a valid identity does not automatically result in permission to access patient data. Identity verification provides evidence concerning who an entity is, whereas authority verification determines whether that entity may perform a particular role within the authorisation process. Third, the architecture provides collective authorisation integrity. Sensitive healthcare data access can be configured to require multiple independently verified participants. Therefore, a single participant cannot unilaterally activate access when the defined authorisation threshold has not been reached. Fourth, the architecture provides policy-bounded access. A valid requester with sufficient approval evidence cannot access healthcare information beyond the purpose or data scope defined by the consent object. Finally, the architecture provides decision accountability. The system maintains evidence concerning the conditions that produced an authorisation decision, thereby supporting auditing and subsequent verification. These properties, together with the separation of interaction and enforcement established in Section 5.3, are summarised in Table 5.3, in which collective authorisation integrity and decision accountability appear as multi-party authorisation integrity and authorisation evidence respectively.</w:t>
+        <w:t>Table 5.3 brings these results together by component of the consent object. For each component of C it gives the check that Algorithm 1 applies at creation, the evidence from the live runs and the automated tests, and the result observed.</w:t>
       </w:r>
     </w:p>
     <w:p>
@@ -4348,7 +4328,1072 @@
           <w:color w:val="FF0000"/>
           <w:sz w:val="20"/>
         </w:rPr>
-        <w:t>Table 5.3: Security properties supported by the proposed MVC-based consent architecture</w:t>
+        <w:t>Table 5.3: Evaluation of the trust-centric consent model: the check applied to each component of C at creation, the evidence and the result</w:t>
+      </w:r>
+    </w:p>
+    <w:tbl>
+      <w:tblPr>
+        <w:tblW w:type="auto" w:w="0"/>
+        <w:jc w:val="center"/>
+        <w:tblBorders>
+          <w:top w:val="single" w:sz="12" w:color="000000" w:space="0"/>
+          <w:left w:val="nil"/>
+          <w:bottom w:val="single" w:sz="12" w:color="000000" w:space="0"/>
+          <w:right w:val="nil"/>
+          <w:insideH w:val="nil"/>
+          <w:insideV w:val="nil"/>
+        </w:tblBorders>
+        <w:tblLayout w:type="fixed"/>
+        <w:tblLook w:firstColumn="1" w:firstRow="1" w:lastColumn="0" w:lastRow="0" w:noHBand="0" w:noVBand="1" w:val="04A0"/>
+      </w:tblPr>
+      <w:tblGrid>
+        <w:gridCol w:w="1531"/>
+        <w:gridCol w:w="2381"/>
+        <w:gridCol w:w="2835"/>
+        <w:gridCol w:w="1757"/>
+      </w:tblGrid>
+      <w:tr>
+        <w:trPr>
+          <w:tblHeader/>
+          <w:cantSplit/>
+        </w:trPr>
+        <w:tc>
+          <w:tcPr>
+            <w:tcW w:type="dxa" w:w="1531"/>
+            <w:tcBorders>
+              <w:top w:val="nil"/>
+              <w:left w:val="nil"/>
+              <w:bottom w:val="single" w:sz="6" w:color="000000" w:space="0"/>
+              <w:right w:val="nil"/>
+              <w:insideH w:val="nil"/>
+              <w:insideV w:val="nil"/>
+            </w:tcBorders>
+          </w:tcPr>
+          <w:p>
+            <w:pPr>
+              <w:keepNext/>
+              <w:spacing w:after="40" w:line="240" w:lineRule="auto"/>
+              <w:jc w:val="left"/>
+            </w:pPr>
+            <w:r>
+              <w:rPr>
+                <w:rFonts w:ascii="Palatino Linotype" w:hAnsi="Palatino Linotype" w:cs="Palatino Linotype"/>
+                <w:b/>
+                <w:color w:val="000000"/>
+                <w:sz w:val="19"/>
+              </w:rPr>
+            </w:r>
+            <w:r>
+              <w:rPr>
+                <w:rFonts w:ascii="Palatino Linotype" w:hAnsi="Palatino Linotype" w:cs="Palatino Linotype"/>
+                <w:b/>
+                <w:color w:val="FF0000"/>
+                <w:sz w:val="19"/>
+              </w:rPr>
+              <w:t>Component</w:t>
+            </w:r>
+          </w:p>
+        </w:tc>
+        <w:tc>
+          <w:tcPr>
+            <w:tcW w:type="dxa" w:w="2381"/>
+            <w:tcBorders>
+              <w:top w:val="nil"/>
+              <w:left w:val="nil"/>
+              <w:bottom w:val="single" w:sz="6" w:color="000000" w:space="0"/>
+              <w:right w:val="nil"/>
+              <w:insideH w:val="nil"/>
+              <w:insideV w:val="nil"/>
+            </w:tcBorders>
+          </w:tcPr>
+          <w:p>
+            <w:pPr>
+              <w:keepNext/>
+              <w:spacing w:after="40" w:line="240" w:lineRule="auto"/>
+              <w:jc w:val="left"/>
+            </w:pPr>
+            <w:r>
+              <w:rPr>
+                <w:rFonts w:ascii="Palatino Linotype" w:hAnsi="Palatino Linotype" w:cs="Palatino Linotype"/>
+                <w:b/>
+                <w:color w:val="000000"/>
+                <w:sz w:val="19"/>
+              </w:rPr>
+            </w:r>
+            <w:r>
+              <w:rPr>
+                <w:rFonts w:ascii="Palatino Linotype" w:hAnsi="Palatino Linotype" w:cs="Palatino Linotype"/>
+                <w:b/>
+                <w:color w:val="FF0000"/>
+                <w:sz w:val="19"/>
+              </w:rPr>
+              <w:t>Check at creation (Algorithm 1)</w:t>
+            </w:r>
+          </w:p>
+        </w:tc>
+        <w:tc>
+          <w:tcPr>
+            <w:tcW w:type="dxa" w:w="2835"/>
+            <w:tcBorders>
+              <w:top w:val="nil"/>
+              <w:left w:val="nil"/>
+              <w:bottom w:val="single" w:sz="6" w:color="000000" w:space="0"/>
+              <w:right w:val="nil"/>
+              <w:insideH w:val="nil"/>
+              <w:insideV w:val="nil"/>
+            </w:tcBorders>
+          </w:tcPr>
+          <w:p>
+            <w:pPr>
+              <w:keepNext/>
+              <w:spacing w:after="40" w:line="240" w:lineRule="auto"/>
+              <w:jc w:val="left"/>
+            </w:pPr>
+            <w:r>
+              <w:rPr>
+                <w:rFonts w:ascii="Palatino Linotype" w:hAnsi="Palatino Linotype" w:cs="Palatino Linotype"/>
+                <w:b/>
+                <w:color w:val="000000"/>
+                <w:sz w:val="19"/>
+              </w:rPr>
+            </w:r>
+            <w:r>
+              <w:rPr>
+                <w:rFonts w:ascii="Palatino Linotype" w:hAnsi="Palatino Linotype" w:cs="Palatino Linotype"/>
+                <w:b/>
+                <w:color w:val="FF0000"/>
+                <w:sz w:val="19"/>
+              </w:rPr>
+              <w:t>Evidence</w:t>
+            </w:r>
+          </w:p>
+        </w:tc>
+        <w:tc>
+          <w:tcPr>
+            <w:tcW w:type="dxa" w:w="1757"/>
+            <w:tcBorders>
+              <w:top w:val="nil"/>
+              <w:left w:val="nil"/>
+              <w:bottom w:val="single" w:sz="6" w:color="000000" w:space="0"/>
+              <w:right w:val="nil"/>
+              <w:insideH w:val="nil"/>
+              <w:insideV w:val="nil"/>
+            </w:tcBorders>
+          </w:tcPr>
+          <w:p>
+            <w:pPr>
+              <w:keepNext/>
+              <w:spacing w:after="40" w:line="240" w:lineRule="auto"/>
+              <w:jc w:val="left"/>
+            </w:pPr>
+            <w:r>
+              <w:rPr>
+                <w:rFonts w:ascii="Palatino Linotype" w:hAnsi="Palatino Linotype" w:cs="Palatino Linotype"/>
+                <w:b/>
+                <w:color w:val="000000"/>
+                <w:sz w:val="19"/>
+              </w:rPr>
+            </w:r>
+            <w:r>
+              <w:rPr>
+                <w:rFonts w:ascii="Palatino Linotype" w:hAnsi="Palatino Linotype" w:cs="Palatino Linotype"/>
+                <w:b/>
+                <w:color w:val="FF0000"/>
+                <w:sz w:val="19"/>
+              </w:rPr>
+              <w:t>Result</w:t>
+            </w:r>
+          </w:p>
+        </w:tc>
+      </w:tr>
+      <w:tr>
+        <w:trPr>
+          <w:cantSplit/>
+        </w:trPr>
+        <w:tc>
+          <w:tcPr>
+            <w:tcW w:type="dxa" w:w="1531"/>
+            <w:tcBorders>
+              <w:top w:val="nil"/>
+              <w:left w:val="nil"/>
+              <w:bottom w:val="nil"/>
+              <w:right w:val="nil"/>
+              <w:insideH w:val="nil"/>
+              <w:insideV w:val="nil"/>
+            </w:tcBorders>
+          </w:tcPr>
+          <w:p>
+            <w:pPr>
+              <w:spacing w:after="40" w:line="240" w:lineRule="auto"/>
+              <w:jc w:val="left"/>
+            </w:pPr>
+            <w:r>
+              <w:rPr>
+                <w:rFonts w:ascii="Palatino Linotype" w:hAnsi="Palatino Linotype" w:cs="Palatino Linotype"/>
+                <w:color w:val="000000"/>
+                <w:sz w:val="19"/>
+              </w:rPr>
+            </w:r>
+            <w:r>
+              <w:rPr>
+                <w:rFonts w:ascii="Palatino Linotype" w:hAnsi="Palatino Linotype" w:cs="Palatino Linotype"/>
+                <w:color w:val="FF0000"/>
+                <w:sz w:val="19"/>
+              </w:rPr>
+              <w:t>I  Identity</w:t>
+            </w:r>
+          </w:p>
+        </w:tc>
+        <w:tc>
+          <w:tcPr>
+            <w:tcW w:type="dxa" w:w="2381"/>
+            <w:tcBorders>
+              <w:top w:val="nil"/>
+              <w:left w:val="nil"/>
+              <w:bottom w:val="nil"/>
+              <w:right w:val="nil"/>
+              <w:insideH w:val="nil"/>
+              <w:insideV w:val="nil"/>
+            </w:tcBorders>
+          </w:tcPr>
+          <w:p>
+            <w:pPr>
+              <w:spacing w:after="40" w:line="240" w:lineRule="auto"/>
+              <w:jc w:val="left"/>
+            </w:pPr>
+            <w:r>
+              <w:rPr>
+                <w:rFonts w:ascii="Palatino Linotype" w:hAnsi="Palatino Linotype" w:cs="Palatino Linotype"/>
+                <w:color w:val="000000"/>
+                <w:sz w:val="19"/>
+              </w:rPr>
+            </w:r>
+            <w:r>
+              <w:rPr>
+                <w:rFonts w:ascii="Palatino Linotype" w:hAnsi="Palatino Linotype" w:cs="Palatino Linotype"/>
+                <w:color w:val="FF0000"/>
+                <w:sz w:val="19"/>
+              </w:rPr>
+              <w:t>Steps 1 to 3: the patient identity, the authorised doctor DID holding a valid doctor credential, and each guardian DID holding a valid guardian credential.</w:t>
+            </w:r>
+          </w:p>
+        </w:tc>
+        <w:tc>
+          <w:tcPr>
+            <w:tcW w:type="dxa" w:w="2835"/>
+            <w:tcBorders>
+              <w:top w:val="nil"/>
+              <w:left w:val="nil"/>
+              <w:bottom w:val="nil"/>
+              <w:right w:val="nil"/>
+              <w:insideH w:val="nil"/>
+              <w:insideV w:val="nil"/>
+            </w:tcBorders>
+          </w:tcPr>
+          <w:p>
+            <w:pPr>
+              <w:spacing w:after="40" w:line="240" w:lineRule="auto"/>
+              <w:jc w:val="left"/>
+            </w:pPr>
+            <w:r>
+              <w:rPr>
+                <w:rFonts w:ascii="Palatino Linotype" w:hAnsi="Palatino Linotype" w:cs="Palatino Linotype"/>
+                <w:color w:val="000000"/>
+                <w:sz w:val="19"/>
+              </w:rPr>
+            </w:r>
+            <w:r>
+              <w:rPr>
+                <w:rFonts w:ascii="Palatino Linotype" w:hAnsi="Palatino Linotype" w:cs="Palatino Linotype"/>
+                <w:color w:val="FF0000"/>
+                <w:sz w:val="19"/>
+              </w:rPr>
+              <w:t>Run of 11 October 2026: a doctor DID without a valid doctor credential and a guardian DID without a valid guardian credential were rejected. Test test_patient_form_checks_the_doctor_and_the_guardians.</w:t>
+            </w:r>
+          </w:p>
+        </w:tc>
+        <w:tc>
+          <w:tcPr>
+            <w:tcW w:type="dxa" w:w="1757"/>
+            <w:tcBorders>
+              <w:top w:val="nil"/>
+              <w:left w:val="nil"/>
+              <w:bottom w:val="nil"/>
+              <w:right w:val="nil"/>
+              <w:insideH w:val="nil"/>
+              <w:insideV w:val="nil"/>
+            </w:tcBorders>
+          </w:tcPr>
+          <w:p>
+            <w:pPr>
+              <w:spacing w:after="40" w:line="240" w:lineRule="auto"/>
+              <w:jc w:val="left"/>
+            </w:pPr>
+            <w:r>
+              <w:rPr>
+                <w:rFonts w:ascii="Palatino Linotype" w:hAnsi="Palatino Linotype" w:cs="Palatino Linotype"/>
+                <w:color w:val="000000"/>
+                <w:sz w:val="19"/>
+              </w:rPr>
+            </w:r>
+            <w:r>
+              <w:rPr>
+                <w:rFonts w:ascii="Palatino Linotype" w:hAnsi="Palatino Linotype" w:cs="Palatino Linotype"/>
+                <w:color w:val="FF0000"/>
+                <w:sz w:val="19"/>
+              </w:rPr>
+              <w:t>Invalid identities rejected before anything is stored; valid identities accepted.</w:t>
+            </w:r>
+          </w:p>
+        </w:tc>
+      </w:tr>
+      <w:tr>
+        <w:trPr>
+          <w:cantSplit/>
+        </w:trPr>
+        <w:tc>
+          <w:tcPr>
+            <w:tcW w:type="dxa" w:w="1531"/>
+            <w:tcBorders>
+              <w:top w:val="nil"/>
+              <w:left w:val="nil"/>
+              <w:bottom w:val="nil"/>
+              <w:right w:val="nil"/>
+              <w:insideH w:val="nil"/>
+              <w:insideV w:val="nil"/>
+            </w:tcBorders>
+          </w:tcPr>
+          <w:p>
+            <w:pPr>
+              <w:spacing w:after="40" w:line="240" w:lineRule="auto"/>
+              <w:jc w:val="left"/>
+            </w:pPr>
+            <w:r>
+              <w:rPr>
+                <w:rFonts w:ascii="Palatino Linotype" w:hAnsi="Palatino Linotype" w:cs="Palatino Linotype"/>
+                <w:color w:val="000000"/>
+                <w:sz w:val="19"/>
+              </w:rPr>
+            </w:r>
+            <w:r>
+              <w:rPr>
+                <w:rFonts w:ascii="Palatino Linotype" w:hAnsi="Palatino Linotype" w:cs="Palatino Linotype"/>
+                <w:color w:val="FF0000"/>
+                <w:sz w:val="19"/>
+              </w:rPr>
+              <w:t>A  Authorisation</w:t>
+            </w:r>
+          </w:p>
+        </w:tc>
+        <w:tc>
+          <w:tcPr>
+            <w:tcW w:type="dxa" w:w="2381"/>
+            <w:tcBorders>
+              <w:top w:val="nil"/>
+              <w:left w:val="nil"/>
+              <w:bottom w:val="nil"/>
+              <w:right w:val="nil"/>
+              <w:insideH w:val="nil"/>
+              <w:insideV w:val="nil"/>
+            </w:tcBorders>
+          </w:tcPr>
+          <w:p>
+            <w:pPr>
+              <w:spacing w:after="40" w:line="240" w:lineRule="auto"/>
+              <w:jc w:val="left"/>
+            </w:pPr>
+            <w:r>
+              <w:rPr>
+                <w:rFonts w:ascii="Palatino Linotype" w:hAnsi="Palatino Linotype" w:cs="Palatino Linotype"/>
+                <w:color w:val="000000"/>
+                <w:sz w:val="19"/>
+              </w:rPr>
+            </w:r>
+            <w:r>
+              <w:rPr>
+                <w:rFonts w:ascii="Palatino Linotype" w:hAnsi="Palatino Linotype" w:cs="Palatino Linotype"/>
+                <w:color w:val="FF0000"/>
+                <w:sz w:val="19"/>
+              </w:rPr>
+              <w:t>Step 3: the guardian set G and the threshold N; no guardian may appear twice.</w:t>
+            </w:r>
+          </w:p>
+        </w:tc>
+        <w:tc>
+          <w:tcPr>
+            <w:tcW w:type="dxa" w:w="2835"/>
+            <w:tcBorders>
+              <w:top w:val="nil"/>
+              <w:left w:val="nil"/>
+              <w:bottom w:val="nil"/>
+              <w:right w:val="nil"/>
+              <w:insideH w:val="nil"/>
+              <w:insideV w:val="nil"/>
+            </w:tcBorders>
+          </w:tcPr>
+          <w:p>
+            <w:pPr>
+              <w:spacing w:after="40" w:line="240" w:lineRule="auto"/>
+              <w:jc w:val="left"/>
+            </w:pPr>
+            <w:r>
+              <w:rPr>
+                <w:rFonts w:ascii="Palatino Linotype" w:hAnsi="Palatino Linotype" w:cs="Palatino Linotype"/>
+                <w:color w:val="000000"/>
+                <w:sz w:val="19"/>
+              </w:rPr>
+            </w:r>
+            <w:r>
+              <w:rPr>
+                <w:rFonts w:ascii="Palatino Linotype" w:hAnsi="Palatino Linotype" w:cs="Palatino Linotype"/>
+                <w:color w:val="FF0000"/>
+                <w:sz w:val="19"/>
+              </w:rPr>
+              <w:t>A specification naming the same guardian twice was rejected (Figure 5.8). Scenario 1 of 24 September 2026 created consent f050c29a with the two guardians did:parent:A and did:parent:B.</w:t>
+            </w:r>
+          </w:p>
+        </w:tc>
+        <w:tc>
+          <w:tcPr>
+            <w:tcW w:type="dxa" w:w="1757"/>
+            <w:tcBorders>
+              <w:top w:val="nil"/>
+              <w:left w:val="nil"/>
+              <w:bottom w:val="nil"/>
+              <w:right w:val="nil"/>
+              <w:insideH w:val="nil"/>
+              <w:insideV w:val="nil"/>
+            </w:tcBorders>
+          </w:tcPr>
+          <w:p>
+            <w:pPr>
+              <w:spacing w:after="40" w:line="240" w:lineRule="auto"/>
+              <w:jc w:val="left"/>
+            </w:pPr>
+            <w:r>
+              <w:rPr>
+                <w:rFonts w:ascii="Palatino Linotype" w:hAnsi="Palatino Linotype" w:cs="Palatino Linotype"/>
+                <w:color w:val="000000"/>
+                <w:sz w:val="19"/>
+              </w:rPr>
+            </w:r>
+            <w:r>
+              <w:rPr>
+                <w:rFonts w:ascii="Palatino Linotype" w:hAnsi="Palatino Linotype" w:cs="Palatino Linotype"/>
+                <w:color w:val="FF0000"/>
+                <w:sz w:val="19"/>
+              </w:rPr>
+              <w:t>Duplicate guardian rejected; consent created with N set to the number of guardians.</w:t>
+            </w:r>
+          </w:p>
+        </w:tc>
+      </w:tr>
+      <w:tr>
+        <w:trPr>
+          <w:cantSplit/>
+        </w:trPr>
+        <w:tc>
+          <w:tcPr>
+            <w:tcW w:type="dxa" w:w="1531"/>
+            <w:tcBorders>
+              <w:top w:val="nil"/>
+              <w:left w:val="nil"/>
+              <w:bottom w:val="nil"/>
+              <w:right w:val="nil"/>
+              <w:insideH w:val="nil"/>
+              <w:insideV w:val="nil"/>
+            </w:tcBorders>
+          </w:tcPr>
+          <w:p>
+            <w:pPr>
+              <w:spacing w:after="40" w:line="240" w:lineRule="auto"/>
+              <w:jc w:val="left"/>
+            </w:pPr>
+            <w:r>
+              <w:rPr>
+                <w:rFonts w:ascii="Palatino Linotype" w:hAnsi="Palatino Linotype" w:cs="Palatino Linotype"/>
+                <w:color w:val="000000"/>
+                <w:sz w:val="19"/>
+              </w:rPr>
+            </w:r>
+            <w:r>
+              <w:rPr>
+                <w:rFonts w:ascii="Palatino Linotype" w:hAnsi="Palatino Linotype" w:cs="Palatino Linotype"/>
+                <w:color w:val="FF0000"/>
+                <w:sz w:val="19"/>
+              </w:rPr>
+              <w:t>P  Policy</w:t>
+            </w:r>
+          </w:p>
+        </w:tc>
+        <w:tc>
+          <w:tcPr>
+            <w:tcW w:type="dxa" w:w="2381"/>
+            <w:tcBorders>
+              <w:top w:val="nil"/>
+              <w:left w:val="nil"/>
+              <w:bottom w:val="nil"/>
+              <w:right w:val="nil"/>
+              <w:insideH w:val="nil"/>
+              <w:insideV w:val="nil"/>
+            </w:tcBorders>
+          </w:tcPr>
+          <w:p>
+            <w:pPr>
+              <w:spacing w:after="40" w:line="240" w:lineRule="auto"/>
+              <w:jc w:val="left"/>
+            </w:pPr>
+            <w:r>
+              <w:rPr>
+                <w:rFonts w:ascii="Palatino Linotype" w:hAnsi="Palatino Linotype" w:cs="Palatino Linotype"/>
+                <w:color w:val="000000"/>
+                <w:sz w:val="19"/>
+              </w:rPr>
+            </w:r>
+            <w:r>
+              <w:rPr>
+                <w:rFonts w:ascii="Palatino Linotype" w:hAnsi="Palatino Linotype" w:cs="Palatino Linotype"/>
+                <w:color w:val="FF0000"/>
+                <w:sz w:val="19"/>
+              </w:rPr>
+              <w:t>Steps 4 and 5: the purpose and the data scope; the data scope must not be empty.</w:t>
+            </w:r>
+          </w:p>
+        </w:tc>
+        <w:tc>
+          <w:tcPr>
+            <w:tcW w:type="dxa" w:w="2835"/>
+            <w:tcBorders>
+              <w:top w:val="nil"/>
+              <w:left w:val="nil"/>
+              <w:bottom w:val="nil"/>
+              <w:right w:val="nil"/>
+              <w:insideH w:val="nil"/>
+              <w:insideV w:val="nil"/>
+            </w:tcBorders>
+          </w:tcPr>
+          <w:p>
+            <w:pPr>
+              <w:spacing w:after="40" w:line="240" w:lineRule="auto"/>
+              <w:jc w:val="left"/>
+            </w:pPr>
+            <w:r>
+              <w:rPr>
+                <w:rFonts w:ascii="Palatino Linotype" w:hAnsi="Palatino Linotype" w:cs="Palatino Linotype"/>
+                <w:color w:val="000000"/>
+                <w:sz w:val="19"/>
+              </w:rPr>
+            </w:r>
+            <w:r>
+              <w:rPr>
+                <w:rFonts w:ascii="Palatino Linotype" w:hAnsi="Palatino Linotype" w:cs="Palatino Linotype"/>
+                <w:color w:val="FF0000"/>
+                <w:sz w:val="19"/>
+              </w:rPr>
+              <w:t>Adversarial test A5 (test_A5_empty_scope_is_rejected). Scenario 1 recorded the four data modules and the purpose Treatment; the purpose vocabulary check is exercised by the automated tests.</w:t>
+            </w:r>
+          </w:p>
+        </w:tc>
+        <w:tc>
+          <w:tcPr>
+            <w:tcW w:type="dxa" w:w="1757"/>
+            <w:tcBorders>
+              <w:top w:val="nil"/>
+              <w:left w:val="nil"/>
+              <w:bottom w:val="nil"/>
+              <w:right w:val="nil"/>
+              <w:insideH w:val="nil"/>
+              <w:insideV w:val="nil"/>
+            </w:tcBorders>
+          </w:tcPr>
+          <w:p>
+            <w:pPr>
+              <w:spacing w:after="40" w:line="240" w:lineRule="auto"/>
+              <w:jc w:val="left"/>
+            </w:pPr>
+            <w:r>
+              <w:rPr>
+                <w:rFonts w:ascii="Palatino Linotype" w:hAnsi="Palatino Linotype" w:cs="Palatino Linotype"/>
+                <w:color w:val="000000"/>
+                <w:sz w:val="19"/>
+              </w:rPr>
+            </w:r>
+            <w:r>
+              <w:rPr>
+                <w:rFonts w:ascii="Palatino Linotype" w:hAnsi="Palatino Linotype" w:cs="Palatino Linotype"/>
+                <w:color w:val="FF0000"/>
+                <w:sz w:val="19"/>
+              </w:rPr>
+              <w:t>Empty scope rejected; purpose and scope recorded in the consent object.</w:t>
+            </w:r>
+          </w:p>
+        </w:tc>
+      </w:tr>
+      <w:tr>
+        <w:trPr>
+          <w:cantSplit/>
+        </w:trPr>
+        <w:tc>
+          <w:tcPr>
+            <w:tcW w:type="dxa" w:w="1531"/>
+            <w:tcBorders>
+              <w:top w:val="nil"/>
+              <w:left w:val="nil"/>
+              <w:bottom w:val="nil"/>
+              <w:right w:val="nil"/>
+              <w:insideH w:val="nil"/>
+              <w:insideV w:val="nil"/>
+            </w:tcBorders>
+          </w:tcPr>
+          <w:p>
+            <w:pPr>
+              <w:spacing w:after="40" w:line="240" w:lineRule="auto"/>
+              <w:jc w:val="left"/>
+            </w:pPr>
+            <w:r>
+              <w:rPr>
+                <w:rFonts w:ascii="Palatino Linotype" w:hAnsi="Palatino Linotype" w:cs="Palatino Linotype"/>
+                <w:color w:val="000000"/>
+                <w:sz w:val="19"/>
+              </w:rPr>
+            </w:r>
+            <w:r>
+              <w:rPr>
+                <w:rFonts w:ascii="Palatino Linotype" w:hAnsi="Palatino Linotype" w:cs="Palatino Linotype"/>
+                <w:color w:val="FF0000"/>
+                <w:sz w:val="19"/>
+              </w:rPr>
+              <w:t>T  Time</w:t>
+            </w:r>
+          </w:p>
+        </w:tc>
+        <w:tc>
+          <w:tcPr>
+            <w:tcW w:type="dxa" w:w="2381"/>
+            <w:tcBorders>
+              <w:top w:val="nil"/>
+              <w:left w:val="nil"/>
+              <w:bottom w:val="nil"/>
+              <w:right w:val="nil"/>
+              <w:insideH w:val="nil"/>
+              <w:insideV w:val="nil"/>
+            </w:tcBorders>
+          </w:tcPr>
+          <w:p>
+            <w:pPr>
+              <w:spacing w:after="40" w:line="240" w:lineRule="auto"/>
+              <w:jc w:val="left"/>
+            </w:pPr>
+            <w:r>
+              <w:rPr>
+                <w:rFonts w:ascii="Palatino Linotype" w:hAnsi="Palatino Linotype" w:cs="Palatino Linotype"/>
+                <w:color w:val="000000"/>
+                <w:sz w:val="19"/>
+              </w:rPr>
+            </w:r>
+            <w:r>
+              <w:rPr>
+                <w:rFonts w:ascii="Palatino Linotype" w:hAnsi="Palatino Linotype" w:cs="Palatino Linotype"/>
+                <w:color w:val="FF0000"/>
+                <w:sz w:val="19"/>
+              </w:rPr>
+              <w:t>Step 6: the validity interval T = (ts, te); the expiry time must be later than the start time.</w:t>
+            </w:r>
+          </w:p>
+        </w:tc>
+        <w:tc>
+          <w:tcPr>
+            <w:tcW w:type="dxa" w:w="2835"/>
+            <w:tcBorders>
+              <w:top w:val="nil"/>
+              <w:left w:val="nil"/>
+              <w:bottom w:val="nil"/>
+              <w:right w:val="nil"/>
+              <w:insideH w:val="nil"/>
+              <w:insideV w:val="nil"/>
+            </w:tcBorders>
+          </w:tcPr>
+          <w:p>
+            <w:pPr>
+              <w:spacing w:after="40" w:line="240" w:lineRule="auto"/>
+              <w:jc w:val="left"/>
+            </w:pPr>
+            <w:r>
+              <w:rPr>
+                <w:rFonts w:ascii="Palatino Linotype" w:hAnsi="Palatino Linotype" w:cs="Palatino Linotype"/>
+                <w:color w:val="000000"/>
+                <w:sz w:val="19"/>
+              </w:rPr>
+            </w:r>
+            <w:r>
+              <w:rPr>
+                <w:rFonts w:ascii="Palatino Linotype" w:hAnsi="Palatino Linotype" w:cs="Palatino Linotype"/>
+                <w:color w:val="FF0000"/>
+                <w:sz w:val="19"/>
+              </w:rPr>
+              <w:t>Scenario 1 recorded a validity window ending on 31 December 2026; the prototype refuses an expiry time that is not later than the start time (Section 5.6.3).</w:t>
+            </w:r>
+          </w:p>
+        </w:tc>
+        <w:tc>
+          <w:tcPr>
+            <w:tcW w:type="dxa" w:w="1757"/>
+            <w:tcBorders>
+              <w:top w:val="nil"/>
+              <w:left w:val="nil"/>
+              <w:bottom w:val="nil"/>
+              <w:right w:val="nil"/>
+              <w:insideH w:val="nil"/>
+              <w:insideV w:val="nil"/>
+            </w:tcBorders>
+          </w:tcPr>
+          <w:p>
+            <w:pPr>
+              <w:spacing w:after="40" w:line="240" w:lineRule="auto"/>
+              <w:jc w:val="left"/>
+            </w:pPr>
+            <w:r>
+              <w:rPr>
+                <w:rFonts w:ascii="Palatino Linotype" w:hAnsi="Palatino Linotype" w:cs="Palatino Linotype"/>
+                <w:color w:val="000000"/>
+                <w:sz w:val="19"/>
+              </w:rPr>
+            </w:r>
+            <w:r>
+              <w:rPr>
+                <w:rFonts w:ascii="Palatino Linotype" w:hAnsi="Palatino Linotype" w:cs="Palatino Linotype"/>
+                <w:color w:val="FF0000"/>
+                <w:sz w:val="19"/>
+              </w:rPr>
+              <w:t>Validity interval recorded; the interval is enforced at every request by VT (Chapter 9).</w:t>
+            </w:r>
+          </w:p>
+        </w:tc>
+      </w:tr>
+      <w:tr>
+        <w:trPr>
+          <w:cantSplit/>
+        </w:trPr>
+        <w:tc>
+          <w:tcPr>
+            <w:tcW w:type="dxa" w:w="1531"/>
+            <w:tcBorders>
+              <w:top w:val="nil"/>
+              <w:left w:val="nil"/>
+              <w:bottom w:val="nil"/>
+              <w:right w:val="nil"/>
+              <w:insideH w:val="nil"/>
+              <w:insideV w:val="nil"/>
+            </w:tcBorders>
+          </w:tcPr>
+          <w:p>
+            <w:pPr>
+              <w:spacing w:after="40" w:line="240" w:lineRule="auto"/>
+              <w:jc w:val="left"/>
+            </w:pPr>
+            <w:r>
+              <w:rPr>
+                <w:rFonts w:ascii="Palatino Linotype" w:hAnsi="Palatino Linotype" w:cs="Palatino Linotype"/>
+                <w:color w:val="000000"/>
+                <w:sz w:val="19"/>
+              </w:rPr>
+            </w:r>
+            <w:r>
+              <w:rPr>
+                <w:rFonts w:ascii="Palatino Linotype" w:hAnsi="Palatino Linotype" w:cs="Palatino Linotype"/>
+                <w:color w:val="FF0000"/>
+                <w:sz w:val="19"/>
+              </w:rPr>
+              <w:t>L  Lifecycle</w:t>
+            </w:r>
+          </w:p>
+        </w:tc>
+        <w:tc>
+          <w:tcPr>
+            <w:tcW w:type="dxa" w:w="2381"/>
+            <w:tcBorders>
+              <w:top w:val="nil"/>
+              <w:left w:val="nil"/>
+              <w:bottom w:val="nil"/>
+              <w:right w:val="nil"/>
+              <w:insideH w:val="nil"/>
+              <w:insideV w:val="nil"/>
+            </w:tcBorders>
+          </w:tcPr>
+          <w:p>
+            <w:pPr>
+              <w:spacing w:after="40" w:line="240" w:lineRule="auto"/>
+              <w:jc w:val="left"/>
+            </w:pPr>
+            <w:r>
+              <w:rPr>
+                <w:rFonts w:ascii="Palatino Linotype" w:hAnsi="Palatino Linotype" w:cs="Palatino Linotype"/>
+                <w:color w:val="000000"/>
+                <w:sz w:val="19"/>
+              </w:rPr>
+            </w:r>
+            <w:r>
+              <w:rPr>
+                <w:rFonts w:ascii="Palatino Linotype" w:hAnsi="Palatino Linotype" w:cs="Palatino Linotype"/>
+                <w:color w:val="FF0000"/>
+                <w:sz w:val="19"/>
+              </w:rPr>
+              <w:t>Steps 8 and 9: the consent identifier is generated and the object is created in the state PENDING_SIGNATURE.</w:t>
+            </w:r>
+          </w:p>
+        </w:tc>
+        <w:tc>
+          <w:tcPr>
+            <w:tcW w:type="dxa" w:w="2835"/>
+            <w:tcBorders>
+              <w:top w:val="nil"/>
+              <w:left w:val="nil"/>
+              <w:bottom w:val="nil"/>
+              <w:right w:val="nil"/>
+              <w:insideH w:val="nil"/>
+              <w:insideV w:val="nil"/>
+            </w:tcBorders>
+          </w:tcPr>
+          <w:p>
+            <w:pPr>
+              <w:spacing w:after="40" w:line="240" w:lineRule="auto"/>
+              <w:jc w:val="left"/>
+            </w:pPr>
+            <w:r>
+              <w:rPr>
+                <w:rFonts w:ascii="Palatino Linotype" w:hAnsi="Palatino Linotype" w:cs="Palatino Linotype"/>
+                <w:color w:val="000000"/>
+                <w:sz w:val="19"/>
+              </w:rPr>
+            </w:r>
+            <w:r>
+              <w:rPr>
+                <w:rFonts w:ascii="Palatino Linotype" w:hAnsi="Palatino Linotype" w:cs="Palatino Linotype"/>
+                <w:color w:val="FF0000"/>
+                <w:sz w:val="19"/>
+              </w:rPr>
+              <w:t>Consents f050c29a, 04da25f5 and 18ab9b62 were created in PENDING_SIGNATURE. Test test_consent_persists_across_reload: the stored object, including its state, is unchanged after a reload from disk.</w:t>
+            </w:r>
+          </w:p>
+        </w:tc>
+        <w:tc>
+          <w:tcPr>
+            <w:tcW w:type="dxa" w:w="1757"/>
+            <w:tcBorders>
+              <w:top w:val="nil"/>
+              <w:left w:val="nil"/>
+              <w:bottom w:val="nil"/>
+              <w:right w:val="nil"/>
+              <w:insideH w:val="nil"/>
+              <w:insideV w:val="nil"/>
+            </w:tcBorders>
+          </w:tcPr>
+          <w:p>
+            <w:pPr>
+              <w:spacing w:after="40" w:line="240" w:lineRule="auto"/>
+              <w:jc w:val="left"/>
+            </w:pPr>
+            <w:r>
+              <w:rPr>
+                <w:rFonts w:ascii="Palatino Linotype" w:hAnsi="Palatino Linotype" w:cs="Palatino Linotype"/>
+                <w:color w:val="000000"/>
+                <w:sz w:val="19"/>
+              </w:rPr>
+            </w:r>
+            <w:r>
+              <w:rPr>
+                <w:rFonts w:ascii="Palatino Linotype" w:hAnsi="Palatino Linotype" w:cs="Palatino Linotype"/>
+                <w:color w:val="FF0000"/>
+                <w:sz w:val="19"/>
+              </w:rPr>
+              <w:t>Created in PENDING_SIGNATURE; no access is possible until the state is ACTIVE (Chapter 9).</w:t>
+            </w:r>
+          </w:p>
+        </w:tc>
+      </w:tr>
+      <w:tr>
+        <w:trPr>
+          <w:cantSplit/>
+        </w:trPr>
+        <w:tc>
+          <w:tcPr>
+            <w:tcW w:type="dxa" w:w="1531"/>
+            <w:tcBorders>
+              <w:top w:val="nil"/>
+              <w:left w:val="nil"/>
+              <w:bottom w:val="nil"/>
+              <w:right w:val="nil"/>
+              <w:insideH w:val="nil"/>
+              <w:insideV w:val="nil"/>
+            </w:tcBorders>
+          </w:tcPr>
+          <w:p>
+            <w:pPr>
+              <w:spacing w:after="40" w:line="240" w:lineRule="auto"/>
+              <w:jc w:val="left"/>
+            </w:pPr>
+            <w:r>
+              <w:rPr>
+                <w:rFonts w:ascii="Palatino Linotype" w:hAnsi="Palatino Linotype" w:cs="Palatino Linotype"/>
+                <w:color w:val="000000"/>
+                <w:sz w:val="19"/>
+              </w:rPr>
+            </w:r>
+            <w:r>
+              <w:rPr>
+                <w:rFonts w:ascii="Palatino Linotype" w:hAnsi="Palatino Linotype" w:cs="Palatino Linotype"/>
+                <w:color w:val="FF0000"/>
+                <w:sz w:val="19"/>
+              </w:rPr>
+              <w:t>E  Evidence</w:t>
+            </w:r>
+          </w:p>
+        </w:tc>
+        <w:tc>
+          <w:tcPr>
+            <w:tcW w:type="dxa" w:w="2381"/>
+            <w:tcBorders>
+              <w:top w:val="nil"/>
+              <w:left w:val="nil"/>
+              <w:bottom w:val="nil"/>
+              <w:right w:val="nil"/>
+              <w:insideH w:val="nil"/>
+              <w:insideV w:val="nil"/>
+            </w:tcBorders>
+          </w:tcPr>
+          <w:p>
+            <w:pPr>
+              <w:spacing w:after="40" w:line="240" w:lineRule="auto"/>
+              <w:jc w:val="left"/>
+            </w:pPr>
+            <w:r>
+              <w:rPr>
+                <w:rFonts w:ascii="Palatino Linotype" w:hAnsi="Palatino Linotype" w:cs="Palatino Linotype"/>
+                <w:color w:val="000000"/>
+                <w:sz w:val="19"/>
+              </w:rPr>
+            </w:r>
+            <w:r>
+              <w:rPr>
+                <w:rFonts w:ascii="Palatino Linotype" w:hAnsi="Palatino Linotype" w:cs="Palatino Linotype"/>
+                <w:color w:val="FF0000"/>
+                <w:sz w:val="19"/>
+              </w:rPr>
+              <w:t>Step 11: the CREATE_CONSENT event is written to the audit ledger with the consent identifier, participants and timestamp.</w:t>
+            </w:r>
+          </w:p>
+        </w:tc>
+        <w:tc>
+          <w:tcPr>
+            <w:tcW w:type="dxa" w:w="2835"/>
+            <w:tcBorders>
+              <w:top w:val="nil"/>
+              <w:left w:val="nil"/>
+              <w:bottom w:val="nil"/>
+              <w:right w:val="nil"/>
+              <w:insideH w:val="nil"/>
+              <w:insideV w:val="nil"/>
+            </w:tcBorders>
+          </w:tcPr>
+          <w:p>
+            <w:pPr>
+              <w:spacing w:after="40" w:line="240" w:lineRule="auto"/>
+              <w:jc w:val="left"/>
+            </w:pPr>
+            <w:r>
+              <w:rPr>
+                <w:rFonts w:ascii="Palatino Linotype" w:hAnsi="Palatino Linotype" w:cs="Palatino Linotype"/>
+                <w:color w:val="000000"/>
+                <w:sz w:val="19"/>
+              </w:rPr>
+            </w:r>
+            <w:r>
+              <w:rPr>
+                <w:rFonts w:ascii="Palatino Linotype" w:hAnsi="Palatino Linotype" w:cs="Palatino Linotype"/>
+                <w:color w:val="FF0000"/>
+                <w:sz w:val="19"/>
+              </w:rPr>
+              <w:t>Ledger events at 09:50:49 (f050c29a), 10:55:49 (04da25f5) and 17:41:36 (18ab9b62), each with the result SUCCESS. Nothing was logged for the three rejected submissions.</w:t>
+            </w:r>
+          </w:p>
+        </w:tc>
+        <w:tc>
+          <w:tcPr>
+            <w:tcW w:type="dxa" w:w="1757"/>
+            <w:tcBorders>
+              <w:top w:val="nil"/>
+              <w:left w:val="nil"/>
+              <w:bottom w:val="nil"/>
+              <w:right w:val="nil"/>
+              <w:insideH w:val="nil"/>
+              <w:insideV w:val="nil"/>
+            </w:tcBorders>
+          </w:tcPr>
+          <w:p>
+            <w:pPr>
+              <w:spacing w:after="40" w:line="240" w:lineRule="auto"/>
+              <w:jc w:val="left"/>
+            </w:pPr>
+            <w:r>
+              <w:rPr>
+                <w:rFonts w:ascii="Palatino Linotype" w:hAnsi="Palatino Linotype" w:cs="Palatino Linotype"/>
+                <w:color w:val="000000"/>
+                <w:sz w:val="19"/>
+              </w:rPr>
+            </w:r>
+            <w:r>
+              <w:rPr>
+                <w:rFonts w:ascii="Palatino Linotype" w:hAnsi="Palatino Linotype" w:cs="Palatino Linotype"/>
+                <w:color w:val="FF0000"/>
+                <w:sz w:val="19"/>
+              </w:rPr>
+              <w:t>Every creation is logged; a rejected specification stores and logs nothing.</w:t>
+            </w:r>
+          </w:p>
+        </w:tc>
+      </w:tr>
+    </w:tbl>
+    <w:p>
+      <w:pPr>
+        <w:pStyle w:val="3"/>
+      </w:pPr>
+      <w:r>
+        <w:rPr>
+          <w:color w:val="FF0000"/>
+        </w:rPr>
+        <w:t>5.7.2 Evaluation of the Architecture against the Security Properties</w:t>
+      </w:r>
+    </w:p>
+    <w:p>
+      <w:pPr/>
+      <w:r>
+        <w:rPr>
+          <w:color w:val="FF0000"/>
+        </w:rPr>
+        <w:t>The proposed MVC architecture provides several foundational security properties for the current stage. These properties emerge from the interaction between the Model, View, and Controller rather than from any single technology.</w:t>
+      </w:r>
+    </w:p>
+    <w:p>
+      <w:pPr/>
+      <w:r>
+        <w:rPr>
+          <w:color w:val="FF0000"/>
+        </w:rPr>
+        <w:t>First, the architecture provides identity-dependent participation. A participant cannot contribute to the authorisation process solely by interacting with the system interface. The corresponding identity and credential must satisfy the verification requirements. Second, the architecture provides authority separation. Possession of a valid identity does not automatically result in permission to access patient data. Identity verification provides evidence concerning who an entity is, whereas authority verification determines whether that entity may perform a particular role within the authorisation process. Third, the architecture provides collective authorisation integrity. Sensitive healthcare data access can be configured to require multiple independently verified participants. Therefore, a single participant cannot unilaterally activate access when the defined authorisation threshold has not been reached. Fourth, the architecture provides policy-bounded access. A valid requester with sufficient approval evidence cannot access healthcare information beyond the purpose or data scope defined by the consent object. Finally, the architecture provides decision accountability. The system maintains evidence concerning the conditions that produced an authorisation decision, thereby supporting auditing and subsequent verification. These properties, together with the separation of interaction and enforcement established in Section 5.3, are summarised in Table 5.4, in which collective authorisation integrity and decision accountability appear as multi-party authorisation integrity and authorisation evidence respectively.</w:t>
+      </w:r>
+    </w:p>
+    <w:p>
+      <w:pPr>
+        <w:keepNext/>
+        <w:spacing w:before="160" w:after="160"/>
+        <w:jc w:val="center"/>
+      </w:pPr>
+      <w:r>
+        <w:rPr>
+          <w:color w:val="FF0000"/>
+          <w:sz w:val="20"/>
+        </w:rPr>
+        <w:t>Table 5.4: Security properties supported by the proposed MVC-based consent architecture</w:t>
       </w:r>
     </w:p>
     <w:tbl>
@@ -5145,7 +6190,7 @@
         <w:rPr>
           <w:color w:val="FF0000"/>
         </w:rPr>
-        <w:t>Each property in Table 5.3 is realised by a component of the architecture and tested in a later chapter. Identity-dependent participation and authority separation are tested in Chapter 6 through the credential checks and the forged-credential attack. Multi-party authorisation integrity is tested in Chapter 7 through the outside-signer, replayed-signature and duplicate-approval attacks. Policy-bounded access is tested in Chapter 8 through the over-scope and empty-scope attacks. Authorisation evidence is checked in every chapter through the audit ledger and in Chapter 10 through the recorded decisions. Separation of interaction and enforcement is the property that the hardening of 1 October 2026 made real: three attacks that the interface already blocked were also accepted by the service functions until the checks were moved into the Controller, as reported in Chapter 10. The architecture therefore does not claim security from MVC itself; it claims it from the placement of every trust-sensitive check inside the Controller, and the tests of the following chapters are the evidence for that claim.</w:t>
+        <w:t>Each property in Table 5.4 is realised by a component of the architecture and tested in a later chapter. Identity-dependent participation and authority separation are tested in Chapter 6 through the credential checks and the forged-credential attack. Multi-party authorisation integrity is tested in Chapter 7 through the outside-signer, replayed-signature and duplicate-approval attacks. Policy-bounded access is tested in Chapter 8 through the over-scope and empty-scope attacks. Authorisation evidence is checked in every chapter through the audit ledger and in Chapter 10 through the recorded decisions. Separation of interaction and enforcement is the property that the hardening of 1 October 2026 made real: three attacks that the interface already blocked were also accepted by the service functions until the checks were moved into the Controller, as reported in Chapter 10. The architecture therefore does not claim security from MVC itself; it claims it from the placement of every trust-sensitive check inside the Controller, and the tests of the following chapters are the evidence for that claim.</w:t>
       </w:r>
     </w:p>
     <w:p>

</xml_diff>

<commit_message>
Thesis Chapter 5 restructured to the model thesis layout: technology list and outline, prototype aims, datasets, stepwise working, evaluation and discussion, conclusion
Co-Authored-By: Claude Fable 5.1 <noreply@anthropic.com>
Claude-Session: https://claude.ai/code/session_01QHSSv245Aernyaebt7V5kS
</commit_message>
<xml_diff>
--- a/docs/Yasir_Thesis_Chapter5.docx
+++ b/docs/Yasir_Thesis_Chapter5.docx
@@ -95,7 +95,152 @@
         <w:rPr>
           <w:color w:val="FF0000"/>
         </w:rPr>
-        <w:t>Chapter 4 presented the research methodology and an overview of the solution. This chapter presents the first two parts of the solution in full: the research architecture that carries the whole framework, and the trust-centric consent model of RO1, which is the object that the other objectives build on. The two belong together because the consent model lives in the Model layer of the architecture, and the architecture is what turns the consent object from a stored record into a condition that the Controller evaluates at every request.</w:t>
+        <w:t>In this chapter, firstly the research architecture on which the whole framework is built is presented. There are three layers in the architecture, and the role of each layer is explained in this chapter. Furthermore, a model is proposed to represent patient consent as an evaluable authorisation object; this provides a complete solution to research objective 1. In this chapter, we also present the results of the validation of the proposed solution to research question one. To validate this research question, we built the HALAH prototype and used the following technologies to test the system:</w:t>
+      </w:r>
+    </w:p>
+    <w:p>
+      <w:pPr>
+        <w:pStyle w:val="a4"/>
+        <w:tabs>
+          <w:tab w:pos="624" w:val="left"/>
+        </w:tabs>
+        <w:ind w:left="624" w:hanging="397"/>
+      </w:pPr>
+      <w:r>
+        <w:rPr>
+          <w:color w:val="FF0000"/>
+        </w:rPr>
+        <w:t>1.</w:t>
+        <w:tab/>
+      </w:r>
+      <w:r>
+        <w:rPr>
+          <w:b/>
+          <w:color w:val="FF0000"/>
+        </w:rPr>
+        <w:t xml:space="preserve">Blockchain: </w:t>
+      </w:r>
+      <w:r>
+        <w:rPr>
+          <w:color w:val="FF0000"/>
+        </w:rPr>
+        <w:t>A blockchain is a decentralised and distributed ledger that records transactions across many computers so that a recorded entry cannot be altered retroactively without altering the blocks that follow it (Wood 2014). In this research, the Ethereum test network Sepolia (Ethereum Foundation 2026b) is used to anchor the state of an approved consent as a soulbound token (Cai 2022) and to record its revocation.</w:t>
+      </w:r>
+    </w:p>
+    <w:p>
+      <w:pPr>
+        <w:pStyle w:val="a4"/>
+        <w:tabs>
+          <w:tab w:pos="624" w:val="left"/>
+        </w:tabs>
+        <w:ind w:left="624" w:hanging="397"/>
+      </w:pPr>
+      <w:r>
+        <w:rPr>
+          <w:color w:val="FF0000"/>
+        </w:rPr>
+        <w:t>2.</w:t>
+        <w:tab/>
+      </w:r>
+      <w:r>
+        <w:rPr>
+          <w:b/>
+          <w:color w:val="FF0000"/>
+        </w:rPr>
+        <w:t xml:space="preserve">Solidity: </w:t>
+      </w:r>
+      <w:r>
+        <w:rPr>
+          <w:color w:val="FF0000"/>
+        </w:rPr>
+        <w:t>The consent contract is written in Solidity, the contract language of Ethereum (Ethereum Foundation 2026a), and was deployed to Sepolia with the Remix environment (Ethereum Foundation 2026c). The contract stores the start time, the expiry time and the revocation flag of each consent and reports whether the consent is valid at a given time.</w:t>
+      </w:r>
+    </w:p>
+    <w:p>
+      <w:pPr>
+        <w:pStyle w:val="a4"/>
+        <w:tabs>
+          <w:tab w:pos="624" w:val="left"/>
+        </w:tabs>
+        <w:ind w:left="624" w:hanging="397"/>
+      </w:pPr>
+      <w:r>
+        <w:rPr>
+          <w:color w:val="FF0000"/>
+        </w:rPr>
+        <w:t>3.</w:t>
+        <w:tab/>
+      </w:r>
+      <w:r>
+        <w:rPr>
+          <w:b/>
+          <w:color w:val="FF0000"/>
+        </w:rPr>
+        <w:t xml:space="preserve">Python and Streamlit: </w:t>
+      </w:r>
+      <w:r>
+        <w:rPr>
+          <w:color w:val="FF0000"/>
+        </w:rPr>
+        <w:t>The Controller and the four role interfaces of the prototype, for the patient, the guardian, the doctor and the auditor, are written in Python. The interfaces use the Streamlit library, and the application talks to Sepolia through the web3 library. Consents, approvals, decisions and the audit ledger are kept in a local SQLite database.</w:t>
+      </w:r>
+    </w:p>
+    <w:p>
+      <w:pPr>
+        <w:pStyle w:val="a4"/>
+        <w:tabs>
+          <w:tab w:pos="624" w:val="left"/>
+        </w:tabs>
+        <w:ind w:left="624" w:hanging="397"/>
+      </w:pPr>
+      <w:r>
+        <w:rPr>
+          <w:color w:val="FF0000"/>
+        </w:rPr>
+        <w:t>4.</w:t>
+        <w:tab/>
+      </w:r>
+      <w:r>
+        <w:rPr>
+          <w:b/>
+          <w:color w:val="FF0000"/>
+        </w:rPr>
+        <w:t xml:space="preserve">EIP-712 and Groth16: </w:t>
+      </w:r>
+      <w:r>
+        <w:rPr>
+          <w:color w:val="FF0000"/>
+        </w:rPr>
+        <w:t>Each guardian approval is a typed-data signature under EIP-712 (Bloemen, Logvinov &amp; Evans 2017), so an approval is bound to one consent, one guardian and one network. The zero-knowledge proof that a consent has not expired is written in circom (iden3 2026b) and is generated and verified with snarkjs (iden3 2026a) under the Groth16 scheme (Groth 2016).</w:t>
+      </w:r>
+    </w:p>
+    <w:p>
+      <w:pPr>
+        <w:pStyle w:val="a4"/>
+        <w:tabs>
+          <w:tab w:pos="624" w:val="left"/>
+        </w:tabs>
+        <w:ind w:left="624" w:hanging="397"/>
+      </w:pPr>
+      <w:r>
+        <w:rPr>
+          <w:color w:val="FF0000"/>
+        </w:rPr>
+        <w:t>5.</w:t>
+        <w:tab/>
+      </w:r>
+      <w:r>
+        <w:rPr>
+          <w:b/>
+          <w:color w:val="FF0000"/>
+        </w:rPr>
+        <w:t xml:space="preserve">Synthea: </w:t>
+      </w:r>
+      <w:r>
+        <w:rPr>
+          <w:color w:val="FF0000"/>
+        </w:rPr>
+        <w:t>The healthcare records of the prototype are synthetic patients produced by the Synthea generator (Walonoski et al. 2018). The dataset is described in Section 5.7.</w:t>
       </w:r>
     </w:p>
     <w:p>
@@ -104,7 +249,7 @@
         <w:rPr>
           <w:color w:val="FF0000"/>
         </w:rPr>
-        <w:t>Sections 5.2 to 5.4 present the architecture: its three layers and their components, where trust is evaluated and where the boundaries between the layers lie, and how the architecture maps to the six research objectives. Section 5.5 presents the consent model: the creation workflow, the structure of the consent object C = (I, A, P, T, L, E), and the creation procedure as Algorithm 1. Section 5.6 shows how the model is implemented in the HALAH prototype: the aims of the prototype, the dataset it uses and the steps of consent creation. Section 5.7 validates the consent creation against the live scenarios, the automated tests and the audit ledger, and evaluates the architecture against the security properties it is designed to provide. Section 5.8 concludes the chapter.</w:t>
+        <w:t>The outline of this chapter is as follows. In Section 5.2, we outline the three layers of the architecture and their components. Subsequently, in Section 5.3 we explain where trust is evaluated and where the boundaries between the layers lie, and in Section 5.4 we map the architecture to the six research objectives. In Section 5.5, we present the trust-centric consent model: the creation workflow, the structure of the consent object C = (I, A, P, T, L, E), and the creation procedure as Algorithm 1. Furthermore, in Section 5.6, we discuss the aims of engineering the prototype system used for validating the proposed consent model. In Section 5.7, we outline and explain the dataset used for validation purposes. In Section 5.8 we explain in detail in a stepwise manner the working of the prototype for consent creation. Finally, in Section 5.9 we discuss the results obtained from the validation of the consent model and the evaluation of the architecture, and Section 5.10 concludes the chapter.</w:t>
       </w:r>
     </w:p>
     <w:p>
@@ -2597,7 +2742,7 @@
         <w:rPr>
           <w:color w:val="FF0000"/>
         </w:rPr>
-        <w:t>Section 5.5.1 shows the consent creation workflow, Section 5.5.2 defines the structure of the consent object, Section 5.5.3 presents the creation procedure and the algorithm, Section 5.6 describes how the model is realised in the prototype, and Section 5.7 validates and evaluates it.</w:t>
+        <w:t>Section 5.5.1 shows the consent creation workflow, Section 5.5.2 defines the structure of the consent object, Section 5.5.3 presents the creation procedure and the algorithm, Section 5.6 describes the aims of the prototype in which the model is realised, Section 5.7 the dataset, Section 5.8 the steps of consent creation, and Section 5.9 validates and evaluates it.</w:t>
       </w:r>
     </w:p>
     <w:p>
@@ -4012,7 +4157,7 @@
         <w:rPr>
           <w:color w:val="FF0000"/>
         </w:rPr>
-        <w:t>is presented in Section 5.7.</w:t>
+        <w:t>is presented in Section 5.9.</w:t>
       </w:r>
     </w:p>
     <w:p>
@@ -4032,15 +4177,33 @@
         <w:rPr>
           <w:color w:val="FF0000"/>
         </w:rPr>
-        <w:t>The prototype was engineered for three aims. The first is to show that the consent model can be built: a patient can create the object C = (I, A, P, T, L, E) through an interface, and the object carries every component that the later checks need. The second is to make the design testable: the same code that the interface calls is called by the automated tests, so a check that the interface enforces can also be attacked directly at the service level, which is how the gaps closed by the hardening of 1 October 2026 were found. The third is to produce evidence: every creation, approval, decision and revocation is written to the audit ledger with the result of each check, so the claims of this and the following chapters can be traced to recorded events rather than to screenshots alone. The prototype is not engineered for throughput or for a production deployment; its purpose is to validate the design.</w:t>
-      </w:r>
-    </w:p>
-    <w:p>
-      <w:pPr>
-        <w:pStyle w:val="3"/>
-      </w:pPr>
-      <w:r>
-        <w:t>5.6.2 Dataset Used for Validation</w:t>
+        <w:t>The primary aim of engineering the prototype system was to simulate the working of the HALAH framework, in which patient consent is created as an evaluable object and every access request is evaluated against it. In particular, in this section, our objective was to use the developed HALAH prototype to test the efficacy of the consent model proposed in Section 5.5: a patient must be able to create the object C = (I, A, P, T, L, E) through an interface, and the object must carry every component that the later checks need. For validating the other objectives of this thesis, we have extended the same prototype (see Chapters 6 to 9).</w:t>
+      </w:r>
+    </w:p>
+    <w:p>
+      <w:pPr/>
+      <w:r>
+        <w:rPr>
+          <w:color w:val="FF0000"/>
+        </w:rPr>
+        <w:t>As discussed in Chapter 2, one of the major challenges of consent management in healthcare is that a stored record of permission does not establish who may act on it, whether every required party agreed, or whether a request stays within the purpose and the data scope that the patient set. With our framework, the consent object carries these conditions, and the prototype makes the design testable: the same code that the interface calls is called by the automated tests, so a check that the interface enforces can also be attacked directly at the service level, which is how the gaps closed by the hardening of 1 October 2026 were found. The prototype also produces evidence: every creation, approval, decision and revocation is written to the audit ledger with the result of each check, so the claims of this and the following chapters can be traced to recorded events rather than to screenshots alone.</w:t>
+      </w:r>
+    </w:p>
+    <w:p>
+      <w:pPr/>
+      <w:r>
+        <w:rPr>
+          <w:color w:val="FF0000"/>
+        </w:rPr>
+        <w:t>We used the Ethereum test network Sepolia as the computing platform for the on-chain part of the prototype, and Solidity as its programming language (Ethereum Foundation 2026a). Sepolia was chosen because it runs the same virtual machine as the Ethereum main network, so the contract and its transactions behave as they would in production, while its ether has no monetary value, which allowed the mint and revoke transactions to be repeated during development. The prototype is not engineered for throughput or for a production deployment; its purpose is to validate the design.</w:t>
+      </w:r>
+    </w:p>
+    <w:p>
+      <w:pPr>
+        <w:pStyle w:val="2"/>
+      </w:pPr>
+      <w:r>
+        <w:t>5.7 Datasets Used for Validation</w:t>
       </w:r>
     </w:p>
     <w:p>
@@ -4067,6 +4230,930 @@
       </w:r>
     </w:p>
     <w:p>
+      <w:pPr/>
+      <w:r>
+        <w:rPr>
+          <w:color w:val="FF0000"/>
+        </w:rPr>
+        <w:t>Table 5.3 shows the Synthea tables loaded by the prototype, the number of records in the loaded subset, and the consent module that each table supplies. The patient DID of the prototype is derived from the Synthea patient identifier, and the records of a patient are selected by that identifier when a consent authorises the module.</w:t>
+      </w:r>
+    </w:p>
+    <w:p>
+      <w:pPr>
+        <w:keepNext/>
+        <w:spacing w:before="160" w:after="160"/>
+        <w:jc w:val="center"/>
+      </w:pPr>
+      <w:r>
+        <w:rPr>
+          <w:color w:val="FF0000"/>
+          <w:sz w:val="20"/>
+        </w:rPr>
+        <w:t>Table 5.3: Synthea tables loaded by the prototype and the consent module supplied by each</w:t>
+      </w:r>
+    </w:p>
+    <w:tbl>
+      <w:tblPr>
+        <w:tblW w:type="auto" w:w="0"/>
+        <w:jc w:val="center"/>
+        <w:tblBorders>
+          <w:top w:val="single" w:sz="12" w:color="000000" w:space="0"/>
+          <w:left w:val="nil"/>
+          <w:bottom w:val="single" w:sz="12" w:color="000000" w:space="0"/>
+          <w:right w:val="nil"/>
+          <w:insideH w:val="nil"/>
+          <w:insideV w:val="nil"/>
+        </w:tblBorders>
+        <w:tblLayout w:type="fixed"/>
+        <w:tblLook w:firstColumn="1" w:firstRow="1" w:lastColumn="0" w:lastRow="0" w:noHBand="0" w:noVBand="1" w:val="04A0"/>
+      </w:tblPr>
+      <w:tblGrid>
+        <w:gridCol w:w="1814"/>
+        <w:gridCol w:w="1814"/>
+        <w:gridCol w:w="2494"/>
+        <w:gridCol w:w="2381"/>
+      </w:tblGrid>
+      <w:tr>
+        <w:trPr>
+          <w:tblHeader/>
+          <w:cantSplit/>
+        </w:trPr>
+        <w:tc>
+          <w:tcPr>
+            <w:tcW w:type="dxa" w:w="1814"/>
+            <w:tcBorders>
+              <w:top w:val="nil"/>
+              <w:left w:val="nil"/>
+              <w:bottom w:val="single" w:sz="6" w:color="000000" w:space="0"/>
+              <w:right w:val="nil"/>
+              <w:insideH w:val="nil"/>
+              <w:insideV w:val="nil"/>
+            </w:tcBorders>
+          </w:tcPr>
+          <w:p>
+            <w:pPr>
+              <w:keepNext/>
+              <w:spacing w:after="40" w:line="240" w:lineRule="auto"/>
+              <w:jc w:val="left"/>
+            </w:pPr>
+            <w:r>
+              <w:rPr>
+                <w:rFonts w:ascii="Palatino Linotype" w:hAnsi="Palatino Linotype" w:cs="Palatino Linotype"/>
+                <w:b/>
+                <w:color w:val="000000"/>
+                <w:sz w:val="19"/>
+              </w:rPr>
+            </w:r>
+            <w:r>
+              <w:rPr>
+                <w:rFonts w:ascii="Palatino Linotype" w:hAnsi="Palatino Linotype" w:cs="Palatino Linotype"/>
+                <w:b/>
+                <w:color w:val="FF0000"/>
+                <w:sz w:val="19"/>
+              </w:rPr>
+              <w:t>Synthea table</w:t>
+            </w:r>
+          </w:p>
+        </w:tc>
+        <w:tc>
+          <w:tcPr>
+            <w:tcW w:type="dxa" w:w="1814"/>
+            <w:tcBorders>
+              <w:top w:val="nil"/>
+              <w:left w:val="nil"/>
+              <w:bottom w:val="single" w:sz="6" w:color="000000" w:space="0"/>
+              <w:right w:val="nil"/>
+              <w:insideH w:val="nil"/>
+              <w:insideV w:val="nil"/>
+            </w:tcBorders>
+          </w:tcPr>
+          <w:p>
+            <w:pPr>
+              <w:keepNext/>
+              <w:spacing w:after="40" w:line="240" w:lineRule="auto"/>
+              <w:jc w:val="left"/>
+            </w:pPr>
+            <w:r>
+              <w:rPr>
+                <w:rFonts w:ascii="Palatino Linotype" w:hAnsi="Palatino Linotype" w:cs="Palatino Linotype"/>
+                <w:b/>
+                <w:color w:val="000000"/>
+                <w:sz w:val="19"/>
+              </w:rPr>
+            </w:r>
+            <w:r>
+              <w:rPr>
+                <w:rFonts w:ascii="Palatino Linotype" w:hAnsi="Palatino Linotype" w:cs="Palatino Linotype"/>
+                <w:b/>
+                <w:color w:val="FF0000"/>
+                <w:sz w:val="19"/>
+              </w:rPr>
+              <w:t>Records in the loaded subset</w:t>
+            </w:r>
+          </w:p>
+        </w:tc>
+        <w:tc>
+          <w:tcPr>
+            <w:tcW w:type="dxa" w:w="2494"/>
+            <w:tcBorders>
+              <w:top w:val="nil"/>
+              <w:left w:val="nil"/>
+              <w:bottom w:val="single" w:sz="6" w:color="000000" w:space="0"/>
+              <w:right w:val="nil"/>
+              <w:insideH w:val="nil"/>
+              <w:insideV w:val="nil"/>
+            </w:tcBorders>
+          </w:tcPr>
+          <w:p>
+            <w:pPr>
+              <w:keepNext/>
+              <w:spacing w:after="40" w:line="240" w:lineRule="auto"/>
+              <w:jc w:val="left"/>
+            </w:pPr>
+            <w:r>
+              <w:rPr>
+                <w:rFonts w:ascii="Palatino Linotype" w:hAnsi="Palatino Linotype" w:cs="Palatino Linotype"/>
+                <w:b/>
+                <w:color w:val="000000"/>
+                <w:sz w:val="19"/>
+              </w:rPr>
+            </w:r>
+            <w:r>
+              <w:rPr>
+                <w:rFonts w:ascii="Palatino Linotype" w:hAnsi="Palatino Linotype" w:cs="Palatino Linotype"/>
+                <w:b/>
+                <w:color w:val="FF0000"/>
+                <w:sz w:val="19"/>
+              </w:rPr>
+              <w:t>Record selected by</w:t>
+            </w:r>
+          </w:p>
+        </w:tc>
+        <w:tc>
+          <w:tcPr>
+            <w:tcW w:type="dxa" w:w="2381"/>
+            <w:tcBorders>
+              <w:top w:val="nil"/>
+              <w:left w:val="nil"/>
+              <w:bottom w:val="single" w:sz="6" w:color="000000" w:space="0"/>
+              <w:right w:val="nil"/>
+              <w:insideH w:val="nil"/>
+              <w:insideV w:val="nil"/>
+            </w:tcBorders>
+          </w:tcPr>
+          <w:p>
+            <w:pPr>
+              <w:keepNext/>
+              <w:spacing w:after="40" w:line="240" w:lineRule="auto"/>
+              <w:jc w:val="left"/>
+            </w:pPr>
+            <w:r>
+              <w:rPr>
+                <w:rFonts w:ascii="Palatino Linotype" w:hAnsi="Palatino Linotype" w:cs="Palatino Linotype"/>
+                <w:b/>
+                <w:color w:val="000000"/>
+                <w:sz w:val="19"/>
+              </w:rPr>
+            </w:r>
+            <w:r>
+              <w:rPr>
+                <w:rFonts w:ascii="Palatino Linotype" w:hAnsi="Palatino Linotype" w:cs="Palatino Linotype"/>
+                <w:b/>
+                <w:color w:val="FF0000"/>
+                <w:sz w:val="19"/>
+              </w:rPr>
+              <w:t>Consent module</w:t>
+            </w:r>
+          </w:p>
+        </w:tc>
+      </w:tr>
+      <w:tr>
+        <w:trPr>
+          <w:cantSplit/>
+        </w:trPr>
+        <w:tc>
+          <w:tcPr>
+            <w:tcW w:type="dxa" w:w="1814"/>
+            <w:tcBorders>
+              <w:top w:val="nil"/>
+              <w:left w:val="nil"/>
+              <w:bottom w:val="nil"/>
+              <w:right w:val="nil"/>
+              <w:insideH w:val="nil"/>
+              <w:insideV w:val="nil"/>
+            </w:tcBorders>
+          </w:tcPr>
+          <w:p>
+            <w:pPr>
+              <w:spacing w:after="40" w:line="240" w:lineRule="auto"/>
+              <w:jc w:val="left"/>
+            </w:pPr>
+            <w:r>
+              <w:rPr>
+                <w:rFonts w:ascii="Palatino Linotype" w:hAnsi="Palatino Linotype" w:cs="Palatino Linotype"/>
+                <w:color w:val="000000"/>
+                <w:sz w:val="19"/>
+              </w:rPr>
+            </w:r>
+            <w:r>
+              <w:rPr>
+                <w:rFonts w:ascii="Palatino Linotype" w:hAnsi="Palatino Linotype" w:cs="Palatino Linotype"/>
+                <w:color w:val="FF0000"/>
+                <w:sz w:val="19"/>
+              </w:rPr>
+              <w:t>patients.csv</w:t>
+            </w:r>
+          </w:p>
+        </w:tc>
+        <w:tc>
+          <w:tcPr>
+            <w:tcW w:type="dxa" w:w="1814"/>
+            <w:tcBorders>
+              <w:top w:val="nil"/>
+              <w:left w:val="nil"/>
+              <w:bottom w:val="nil"/>
+              <w:right w:val="nil"/>
+              <w:insideH w:val="nil"/>
+              <w:insideV w:val="nil"/>
+            </w:tcBorders>
+          </w:tcPr>
+          <w:p>
+            <w:pPr>
+              <w:spacing w:after="40" w:line="240" w:lineRule="auto"/>
+              <w:jc w:val="left"/>
+            </w:pPr>
+            <w:r>
+              <w:rPr>
+                <w:rFonts w:ascii="Palatino Linotype" w:hAnsi="Palatino Linotype" w:cs="Palatino Linotype"/>
+                <w:color w:val="000000"/>
+                <w:sz w:val="19"/>
+              </w:rPr>
+            </w:r>
+            <w:r>
+              <w:rPr>
+                <w:rFonts w:ascii="Palatino Linotype" w:hAnsi="Palatino Linotype" w:cs="Palatino Linotype"/>
+                <w:color w:val="FF0000"/>
+                <w:sz w:val="19"/>
+              </w:rPr>
+              <w:t>113</w:t>
+            </w:r>
+          </w:p>
+        </w:tc>
+        <w:tc>
+          <w:tcPr>
+            <w:tcW w:type="dxa" w:w="2494"/>
+            <w:tcBorders>
+              <w:top w:val="nil"/>
+              <w:left w:val="nil"/>
+              <w:bottom w:val="nil"/>
+              <w:right w:val="nil"/>
+              <w:insideH w:val="nil"/>
+              <w:insideV w:val="nil"/>
+            </w:tcBorders>
+          </w:tcPr>
+          <w:p>
+            <w:pPr>
+              <w:spacing w:after="40" w:line="240" w:lineRule="auto"/>
+              <w:jc w:val="left"/>
+            </w:pPr>
+            <w:r>
+              <w:rPr>
+                <w:rFonts w:ascii="Palatino Linotype" w:hAnsi="Palatino Linotype" w:cs="Palatino Linotype"/>
+                <w:color w:val="000000"/>
+                <w:sz w:val="19"/>
+              </w:rPr>
+            </w:r>
+            <w:r>
+              <w:rPr>
+                <w:rFonts w:ascii="Palatino Linotype" w:hAnsi="Palatino Linotype" w:cs="Palatino Linotype"/>
+                <w:color w:val="FF0000"/>
+                <w:sz w:val="19"/>
+              </w:rPr>
+              <w:t>Id (the source of the patient DID)</w:t>
+            </w:r>
+          </w:p>
+        </w:tc>
+        <w:tc>
+          <w:tcPr>
+            <w:tcW w:type="dxa" w:w="2381"/>
+            <w:tcBorders>
+              <w:top w:val="nil"/>
+              <w:left w:val="nil"/>
+              <w:bottom w:val="nil"/>
+              <w:right w:val="nil"/>
+              <w:insideH w:val="nil"/>
+              <w:insideV w:val="nil"/>
+            </w:tcBorders>
+          </w:tcPr>
+          <w:p>
+            <w:pPr>
+              <w:spacing w:after="40" w:line="240" w:lineRule="auto"/>
+              <w:jc w:val="left"/>
+            </w:pPr>
+            <w:r>
+              <w:rPr>
+                <w:rFonts w:ascii="Palatino Linotype" w:hAnsi="Palatino Linotype" w:cs="Palatino Linotype"/>
+                <w:color w:val="000000"/>
+                <w:sz w:val="19"/>
+              </w:rPr>
+            </w:r>
+            <w:r>
+              <w:rPr>
+                <w:rFonts w:ascii="Palatino Linotype" w:hAnsi="Palatino Linotype" w:cs="Palatino Linotype"/>
+                <w:color w:val="FF0000"/>
+                <w:sz w:val="19"/>
+              </w:rPr>
+              <w:t>Patient identity in the patient interface</w:t>
+            </w:r>
+          </w:p>
+        </w:tc>
+      </w:tr>
+      <w:tr>
+        <w:trPr>
+          <w:cantSplit/>
+        </w:trPr>
+        <w:tc>
+          <w:tcPr>
+            <w:tcW w:type="dxa" w:w="1814"/>
+            <w:tcBorders>
+              <w:top w:val="nil"/>
+              <w:left w:val="nil"/>
+              <w:bottom w:val="nil"/>
+              <w:right w:val="nil"/>
+              <w:insideH w:val="nil"/>
+              <w:insideV w:val="nil"/>
+            </w:tcBorders>
+          </w:tcPr>
+          <w:p>
+            <w:pPr>
+              <w:spacing w:after="40" w:line="240" w:lineRule="auto"/>
+              <w:jc w:val="left"/>
+            </w:pPr>
+            <w:r>
+              <w:rPr>
+                <w:rFonts w:ascii="Palatino Linotype" w:hAnsi="Palatino Linotype" w:cs="Palatino Linotype"/>
+                <w:color w:val="000000"/>
+                <w:sz w:val="19"/>
+              </w:rPr>
+            </w:r>
+            <w:r>
+              <w:rPr>
+                <w:rFonts w:ascii="Palatino Linotype" w:hAnsi="Palatino Linotype" w:cs="Palatino Linotype"/>
+                <w:color w:val="FF0000"/>
+                <w:sz w:val="19"/>
+              </w:rPr>
+              <w:t>observations.csv</w:t>
+            </w:r>
+          </w:p>
+        </w:tc>
+        <w:tc>
+          <w:tcPr>
+            <w:tcW w:type="dxa" w:w="1814"/>
+            <w:tcBorders>
+              <w:top w:val="nil"/>
+              <w:left w:val="nil"/>
+              <w:bottom w:val="nil"/>
+              <w:right w:val="nil"/>
+              <w:insideH w:val="nil"/>
+              <w:insideV w:val="nil"/>
+            </w:tcBorders>
+          </w:tcPr>
+          <w:p>
+            <w:pPr>
+              <w:spacing w:after="40" w:line="240" w:lineRule="auto"/>
+              <w:jc w:val="left"/>
+            </w:pPr>
+            <w:r>
+              <w:rPr>
+                <w:rFonts w:ascii="Palatino Linotype" w:hAnsi="Palatino Linotype" w:cs="Palatino Linotype"/>
+                <w:color w:val="000000"/>
+                <w:sz w:val="19"/>
+              </w:rPr>
+            </w:r>
+            <w:r>
+              <w:rPr>
+                <w:rFonts w:ascii="Palatino Linotype" w:hAnsi="Palatino Linotype" w:cs="Palatino Linotype"/>
+                <w:color w:val="FF0000"/>
+                <w:sz w:val="19"/>
+              </w:rPr>
+              <w:t>4,428</w:t>
+            </w:r>
+          </w:p>
+        </w:tc>
+        <w:tc>
+          <w:tcPr>
+            <w:tcW w:type="dxa" w:w="2494"/>
+            <w:tcBorders>
+              <w:top w:val="nil"/>
+              <w:left w:val="nil"/>
+              <w:bottom w:val="nil"/>
+              <w:right w:val="nil"/>
+              <w:insideH w:val="nil"/>
+              <w:insideV w:val="nil"/>
+            </w:tcBorders>
+          </w:tcPr>
+          <w:p>
+            <w:pPr>
+              <w:spacing w:after="40" w:line="240" w:lineRule="auto"/>
+              <w:jc w:val="left"/>
+            </w:pPr>
+            <w:r>
+              <w:rPr>
+                <w:rFonts w:ascii="Palatino Linotype" w:hAnsi="Palatino Linotype" w:cs="Palatino Linotype"/>
+                <w:color w:val="000000"/>
+                <w:sz w:val="19"/>
+              </w:rPr>
+            </w:r>
+            <w:r>
+              <w:rPr>
+                <w:rFonts w:ascii="Palatino Linotype" w:hAnsi="Palatino Linotype" w:cs="Palatino Linotype"/>
+                <w:color w:val="FF0000"/>
+                <w:sz w:val="19"/>
+              </w:rPr>
+              <w:t>PATIENT</w:t>
+            </w:r>
+          </w:p>
+        </w:tc>
+        <w:tc>
+          <w:tcPr>
+            <w:tcW w:type="dxa" w:w="2381"/>
+            <w:tcBorders>
+              <w:top w:val="nil"/>
+              <w:left w:val="nil"/>
+              <w:bottom w:val="nil"/>
+              <w:right w:val="nil"/>
+              <w:insideH w:val="nil"/>
+              <w:insideV w:val="nil"/>
+            </w:tcBorders>
+          </w:tcPr>
+          <w:p>
+            <w:pPr>
+              <w:spacing w:after="40" w:line="240" w:lineRule="auto"/>
+              <w:jc w:val="left"/>
+            </w:pPr>
+            <w:r>
+              <w:rPr>
+                <w:rFonts w:ascii="Palatino Linotype" w:hAnsi="Palatino Linotype" w:cs="Palatino Linotype"/>
+                <w:color w:val="000000"/>
+                <w:sz w:val="19"/>
+              </w:rPr>
+            </w:r>
+            <w:r>
+              <w:rPr>
+                <w:rFonts w:ascii="Palatino Linotype" w:hAnsi="Palatino Linotype" w:cs="Palatino Linotype"/>
+                <w:color w:val="FF0000"/>
+                <w:sz w:val="19"/>
+              </w:rPr>
+              <w:t>Observation</w:t>
+            </w:r>
+          </w:p>
+        </w:tc>
+      </w:tr>
+      <w:tr>
+        <w:trPr>
+          <w:cantSplit/>
+        </w:trPr>
+        <w:tc>
+          <w:tcPr>
+            <w:tcW w:type="dxa" w:w="1814"/>
+            <w:tcBorders>
+              <w:top w:val="nil"/>
+              <w:left w:val="nil"/>
+              <w:bottom w:val="nil"/>
+              <w:right w:val="nil"/>
+              <w:insideH w:val="nil"/>
+              <w:insideV w:val="nil"/>
+            </w:tcBorders>
+          </w:tcPr>
+          <w:p>
+            <w:pPr>
+              <w:spacing w:after="40" w:line="240" w:lineRule="auto"/>
+              <w:jc w:val="left"/>
+            </w:pPr>
+            <w:r>
+              <w:rPr>
+                <w:rFonts w:ascii="Palatino Linotype" w:hAnsi="Palatino Linotype" w:cs="Palatino Linotype"/>
+                <w:color w:val="000000"/>
+                <w:sz w:val="19"/>
+              </w:rPr>
+            </w:r>
+            <w:r>
+              <w:rPr>
+                <w:rFonts w:ascii="Palatino Linotype" w:hAnsi="Palatino Linotype" w:cs="Palatino Linotype"/>
+                <w:color w:val="FF0000"/>
+                <w:sz w:val="19"/>
+              </w:rPr>
+              <w:t>medications.csv</w:t>
+            </w:r>
+          </w:p>
+        </w:tc>
+        <w:tc>
+          <w:tcPr>
+            <w:tcW w:type="dxa" w:w="1814"/>
+            <w:tcBorders>
+              <w:top w:val="nil"/>
+              <w:left w:val="nil"/>
+              <w:bottom w:val="nil"/>
+              <w:right w:val="nil"/>
+              <w:insideH w:val="nil"/>
+              <w:insideV w:val="nil"/>
+            </w:tcBorders>
+          </w:tcPr>
+          <w:p>
+            <w:pPr>
+              <w:spacing w:after="40" w:line="240" w:lineRule="auto"/>
+              <w:jc w:val="left"/>
+            </w:pPr>
+            <w:r>
+              <w:rPr>
+                <w:rFonts w:ascii="Palatino Linotype" w:hAnsi="Palatino Linotype" w:cs="Palatino Linotype"/>
+                <w:color w:val="000000"/>
+                <w:sz w:val="19"/>
+              </w:rPr>
+            </w:r>
+            <w:r>
+              <w:rPr>
+                <w:rFonts w:ascii="Palatino Linotype" w:hAnsi="Palatino Linotype" w:cs="Palatino Linotype"/>
+                <w:color w:val="FF0000"/>
+                <w:sz w:val="19"/>
+              </w:rPr>
+              <w:t>2,931</w:t>
+            </w:r>
+          </w:p>
+        </w:tc>
+        <w:tc>
+          <w:tcPr>
+            <w:tcW w:type="dxa" w:w="2494"/>
+            <w:tcBorders>
+              <w:top w:val="nil"/>
+              <w:left w:val="nil"/>
+              <w:bottom w:val="nil"/>
+              <w:right w:val="nil"/>
+              <w:insideH w:val="nil"/>
+              <w:insideV w:val="nil"/>
+            </w:tcBorders>
+          </w:tcPr>
+          <w:p>
+            <w:pPr>
+              <w:spacing w:after="40" w:line="240" w:lineRule="auto"/>
+              <w:jc w:val="left"/>
+            </w:pPr>
+            <w:r>
+              <w:rPr>
+                <w:rFonts w:ascii="Palatino Linotype" w:hAnsi="Palatino Linotype" w:cs="Palatino Linotype"/>
+                <w:color w:val="000000"/>
+                <w:sz w:val="19"/>
+              </w:rPr>
+            </w:r>
+            <w:r>
+              <w:rPr>
+                <w:rFonts w:ascii="Palatino Linotype" w:hAnsi="Palatino Linotype" w:cs="Palatino Linotype"/>
+                <w:color w:val="FF0000"/>
+                <w:sz w:val="19"/>
+              </w:rPr>
+              <w:t>PATIENT</w:t>
+            </w:r>
+          </w:p>
+        </w:tc>
+        <w:tc>
+          <w:tcPr>
+            <w:tcW w:type="dxa" w:w="2381"/>
+            <w:tcBorders>
+              <w:top w:val="nil"/>
+              <w:left w:val="nil"/>
+              <w:bottom w:val="nil"/>
+              <w:right w:val="nil"/>
+              <w:insideH w:val="nil"/>
+              <w:insideV w:val="nil"/>
+            </w:tcBorders>
+          </w:tcPr>
+          <w:p>
+            <w:pPr>
+              <w:spacing w:after="40" w:line="240" w:lineRule="auto"/>
+              <w:jc w:val="left"/>
+            </w:pPr>
+            <w:r>
+              <w:rPr>
+                <w:rFonts w:ascii="Palatino Linotype" w:hAnsi="Palatino Linotype" w:cs="Palatino Linotype"/>
+                <w:color w:val="000000"/>
+                <w:sz w:val="19"/>
+              </w:rPr>
+            </w:r>
+            <w:r>
+              <w:rPr>
+                <w:rFonts w:ascii="Palatino Linotype" w:hAnsi="Palatino Linotype" w:cs="Palatino Linotype"/>
+                <w:color w:val="FF0000"/>
+                <w:sz w:val="19"/>
+              </w:rPr>
+              <w:t>Medication</w:t>
+            </w:r>
+          </w:p>
+        </w:tc>
+      </w:tr>
+      <w:tr>
+        <w:trPr>
+          <w:cantSplit/>
+        </w:trPr>
+        <w:tc>
+          <w:tcPr>
+            <w:tcW w:type="dxa" w:w="1814"/>
+            <w:tcBorders>
+              <w:top w:val="nil"/>
+              <w:left w:val="nil"/>
+              <w:bottom w:val="nil"/>
+              <w:right w:val="nil"/>
+              <w:insideH w:val="nil"/>
+              <w:insideV w:val="nil"/>
+            </w:tcBorders>
+          </w:tcPr>
+          <w:p>
+            <w:pPr>
+              <w:spacing w:after="40" w:line="240" w:lineRule="auto"/>
+              <w:jc w:val="left"/>
+            </w:pPr>
+            <w:r>
+              <w:rPr>
+                <w:rFonts w:ascii="Palatino Linotype" w:hAnsi="Palatino Linotype" w:cs="Palatino Linotype"/>
+                <w:color w:val="000000"/>
+                <w:sz w:val="19"/>
+              </w:rPr>
+            </w:r>
+            <w:r>
+              <w:rPr>
+                <w:rFonts w:ascii="Palatino Linotype" w:hAnsi="Palatino Linotype" w:cs="Palatino Linotype"/>
+                <w:color w:val="FF0000"/>
+                <w:sz w:val="19"/>
+              </w:rPr>
+              <w:t>conditions.csv</w:t>
+            </w:r>
+          </w:p>
+        </w:tc>
+        <w:tc>
+          <w:tcPr>
+            <w:tcW w:type="dxa" w:w="1814"/>
+            <w:tcBorders>
+              <w:top w:val="nil"/>
+              <w:left w:val="nil"/>
+              <w:bottom w:val="nil"/>
+              <w:right w:val="nil"/>
+              <w:insideH w:val="nil"/>
+              <w:insideV w:val="nil"/>
+            </w:tcBorders>
+          </w:tcPr>
+          <w:p>
+            <w:pPr>
+              <w:spacing w:after="40" w:line="240" w:lineRule="auto"/>
+              <w:jc w:val="left"/>
+            </w:pPr>
+            <w:r>
+              <w:rPr>
+                <w:rFonts w:ascii="Palatino Linotype" w:hAnsi="Palatino Linotype" w:cs="Palatino Linotype"/>
+                <w:color w:val="000000"/>
+                <w:sz w:val="19"/>
+              </w:rPr>
+            </w:r>
+            <w:r>
+              <w:rPr>
+                <w:rFonts w:ascii="Palatino Linotype" w:hAnsi="Palatino Linotype" w:cs="Palatino Linotype"/>
+                <w:color w:val="FF0000"/>
+                <w:sz w:val="19"/>
+              </w:rPr>
+              <w:t>4,748</w:t>
+            </w:r>
+          </w:p>
+        </w:tc>
+        <w:tc>
+          <w:tcPr>
+            <w:tcW w:type="dxa" w:w="2494"/>
+            <w:tcBorders>
+              <w:top w:val="nil"/>
+              <w:left w:val="nil"/>
+              <w:bottom w:val="nil"/>
+              <w:right w:val="nil"/>
+              <w:insideH w:val="nil"/>
+              <w:insideV w:val="nil"/>
+            </w:tcBorders>
+          </w:tcPr>
+          <w:p>
+            <w:pPr>
+              <w:spacing w:after="40" w:line="240" w:lineRule="auto"/>
+              <w:jc w:val="left"/>
+            </w:pPr>
+            <w:r>
+              <w:rPr>
+                <w:rFonts w:ascii="Palatino Linotype" w:hAnsi="Palatino Linotype" w:cs="Palatino Linotype"/>
+                <w:color w:val="000000"/>
+                <w:sz w:val="19"/>
+              </w:rPr>
+            </w:r>
+            <w:r>
+              <w:rPr>
+                <w:rFonts w:ascii="Palatino Linotype" w:hAnsi="Palatino Linotype" w:cs="Palatino Linotype"/>
+                <w:color w:val="FF0000"/>
+                <w:sz w:val="19"/>
+              </w:rPr>
+              <w:t>PATIENT</w:t>
+            </w:r>
+          </w:p>
+        </w:tc>
+        <w:tc>
+          <w:tcPr>
+            <w:tcW w:type="dxa" w:w="2381"/>
+            <w:tcBorders>
+              <w:top w:val="nil"/>
+              <w:left w:val="nil"/>
+              <w:bottom w:val="nil"/>
+              <w:right w:val="nil"/>
+              <w:insideH w:val="nil"/>
+              <w:insideV w:val="nil"/>
+            </w:tcBorders>
+          </w:tcPr>
+          <w:p>
+            <w:pPr>
+              <w:spacing w:after="40" w:line="240" w:lineRule="auto"/>
+              <w:jc w:val="left"/>
+            </w:pPr>
+            <w:r>
+              <w:rPr>
+                <w:rFonts w:ascii="Palatino Linotype" w:hAnsi="Palatino Linotype" w:cs="Palatino Linotype"/>
+                <w:color w:val="000000"/>
+                <w:sz w:val="19"/>
+              </w:rPr>
+            </w:r>
+            <w:r>
+              <w:rPr>
+                <w:rFonts w:ascii="Palatino Linotype" w:hAnsi="Palatino Linotype" w:cs="Palatino Linotype"/>
+                <w:color w:val="FF0000"/>
+                <w:sz w:val="19"/>
+              </w:rPr>
+              <w:t>Condition</w:t>
+            </w:r>
+          </w:p>
+        </w:tc>
+      </w:tr>
+      <w:tr>
+        <w:trPr>
+          <w:cantSplit/>
+        </w:trPr>
+        <w:tc>
+          <w:tcPr>
+            <w:tcW w:type="dxa" w:w="1814"/>
+            <w:tcBorders>
+              <w:top w:val="nil"/>
+              <w:left w:val="nil"/>
+              <w:bottom w:val="nil"/>
+              <w:right w:val="nil"/>
+              <w:insideH w:val="nil"/>
+              <w:insideV w:val="nil"/>
+            </w:tcBorders>
+          </w:tcPr>
+          <w:p>
+            <w:pPr>
+              <w:spacing w:after="40" w:line="240" w:lineRule="auto"/>
+              <w:jc w:val="left"/>
+            </w:pPr>
+            <w:r>
+              <w:rPr>
+                <w:rFonts w:ascii="Palatino Linotype" w:hAnsi="Palatino Linotype" w:cs="Palatino Linotype"/>
+                <w:color w:val="000000"/>
+                <w:sz w:val="19"/>
+              </w:rPr>
+            </w:r>
+            <w:r>
+              <w:rPr>
+                <w:rFonts w:ascii="Palatino Linotype" w:hAnsi="Palatino Linotype" w:cs="Palatino Linotype"/>
+                <w:color w:val="FF0000"/>
+                <w:sz w:val="19"/>
+              </w:rPr>
+              <w:t>procedures.csv</w:t>
+            </w:r>
+          </w:p>
+        </w:tc>
+        <w:tc>
+          <w:tcPr>
+            <w:tcW w:type="dxa" w:w="1814"/>
+            <w:tcBorders>
+              <w:top w:val="nil"/>
+              <w:left w:val="nil"/>
+              <w:bottom w:val="nil"/>
+              <w:right w:val="nil"/>
+              <w:insideH w:val="nil"/>
+              <w:insideV w:val="nil"/>
+            </w:tcBorders>
+          </w:tcPr>
+          <w:p>
+            <w:pPr>
+              <w:spacing w:after="40" w:line="240" w:lineRule="auto"/>
+              <w:jc w:val="left"/>
+            </w:pPr>
+            <w:r>
+              <w:rPr>
+                <w:rFonts w:ascii="Palatino Linotype" w:hAnsi="Palatino Linotype" w:cs="Palatino Linotype"/>
+                <w:color w:val="000000"/>
+                <w:sz w:val="19"/>
+              </w:rPr>
+            </w:r>
+            <w:r>
+              <w:rPr>
+                <w:rFonts w:ascii="Palatino Linotype" w:hAnsi="Palatino Linotype" w:cs="Palatino Linotype"/>
+                <w:color w:val="FF0000"/>
+                <w:sz w:val="19"/>
+              </w:rPr>
+              <w:t>4,237</w:t>
+            </w:r>
+          </w:p>
+        </w:tc>
+        <w:tc>
+          <w:tcPr>
+            <w:tcW w:type="dxa" w:w="2494"/>
+            <w:tcBorders>
+              <w:top w:val="nil"/>
+              <w:left w:val="nil"/>
+              <w:bottom w:val="nil"/>
+              <w:right w:val="nil"/>
+              <w:insideH w:val="nil"/>
+              <w:insideV w:val="nil"/>
+            </w:tcBorders>
+          </w:tcPr>
+          <w:p>
+            <w:pPr>
+              <w:spacing w:after="40" w:line="240" w:lineRule="auto"/>
+              <w:jc w:val="left"/>
+            </w:pPr>
+            <w:r>
+              <w:rPr>
+                <w:rFonts w:ascii="Palatino Linotype" w:hAnsi="Palatino Linotype" w:cs="Palatino Linotype"/>
+                <w:color w:val="000000"/>
+                <w:sz w:val="19"/>
+              </w:rPr>
+            </w:r>
+            <w:r>
+              <w:rPr>
+                <w:rFonts w:ascii="Palatino Linotype" w:hAnsi="Palatino Linotype" w:cs="Palatino Linotype"/>
+                <w:color w:val="FF0000"/>
+                <w:sz w:val="19"/>
+              </w:rPr>
+              <w:t>PATIENT</w:t>
+            </w:r>
+          </w:p>
+        </w:tc>
+        <w:tc>
+          <w:tcPr>
+            <w:tcW w:type="dxa" w:w="2381"/>
+            <w:tcBorders>
+              <w:top w:val="nil"/>
+              <w:left w:val="nil"/>
+              <w:bottom w:val="nil"/>
+              <w:right w:val="nil"/>
+              <w:insideH w:val="nil"/>
+              <w:insideV w:val="nil"/>
+            </w:tcBorders>
+          </w:tcPr>
+          <w:p>
+            <w:pPr>
+              <w:spacing w:after="40" w:line="240" w:lineRule="auto"/>
+              <w:jc w:val="left"/>
+            </w:pPr>
+            <w:r>
+              <w:rPr>
+                <w:rFonts w:ascii="Palatino Linotype" w:hAnsi="Palatino Linotype" w:cs="Palatino Linotype"/>
+                <w:color w:val="000000"/>
+                <w:sz w:val="19"/>
+              </w:rPr>
+            </w:r>
+            <w:r>
+              <w:rPr>
+                <w:rFonts w:ascii="Palatino Linotype" w:hAnsi="Palatino Linotype" w:cs="Palatino Linotype"/>
+                <w:color w:val="FF0000"/>
+                <w:sz w:val="19"/>
+              </w:rPr>
+              <w:t>Procedure</w:t>
+            </w:r>
+          </w:p>
+        </w:tc>
+      </w:tr>
+    </w:tbl>
+    <w:p>
+      <w:pPr>
+        <w:pStyle w:val="2"/>
+      </w:pPr>
+      <w:r>
+        <w:rPr>
+          <w:color w:val="FF0000"/>
+        </w:rPr>
+        <w:t>5.8 Steps in the Working of the Prototype System for Consent Creation</w:t>
+      </w:r>
+    </w:p>
+    <w:p>
+      <w:pPr/>
+      <w:r>
+        <w:rPr>
+          <w:color w:val="FF0000"/>
+        </w:rPr>
+        <w:t>In order to create a consent, the HALAH prototype carries out its work at two levels, namely the patient interface and the service layer. In the patient interface, the consent specification is entered and checked. In the service layer, the consent object is constructed, stored and recorded in the audit ledger. The steps at both levels follow Algorithm 1 and are explained below in Section 5.8.1 and Section 5.8.2 respectively, and Figure 5.7 shows the patient interface after a consent has been created.</w:t>
+      </w:r>
+    </w:p>
+    <w:p>
       <w:pPr>
         <w:pStyle w:val="3"/>
       </w:pPr>
@@ -4074,7 +5161,7 @@
         <w:rPr>
           <w:color w:val="FF0000"/>
         </w:rPr>
-        <w:t>5.6.3 Steps in the Working of the Prototype for Consent Creation</w:t>
+        <w:t>5.8.1 Steps in the patient interface</w:t>
       </w:r>
     </w:p>
     <w:p>
@@ -4083,7 +5170,7 @@
         <w:rPr>
           <w:color w:val="FF0000"/>
         </w:rPr>
-        <w:t>The creation of a consent in the prototype follows the steps of Algorithm 1 as shown in Figure 5.7:</w:t>
+        <w:t>1. The patient selects the role Patient and their own DID, which the prototype loads from the record set.</w:t>
       </w:r>
     </w:p>
     <w:p>
@@ -4092,7 +5179,7 @@
         <w:rPr>
           <w:color w:val="FF0000"/>
         </w:rPr>
-        <w:t>1. The patient selects the role Patient and their own DID, which the prototype loads from the record set.</w:t>
+        <w:t>2. The patient enters the DID of the authorised doctor and the DIDs of the guardians, separated by commas.</w:t>
       </w:r>
     </w:p>
     <w:p>
@@ -4101,7 +5188,7 @@
         <w:rPr>
           <w:color w:val="FF0000"/>
         </w:rPr>
-        <w:t>2. The patient enters the DID of the authorised doctor and the DIDs of the guardians, separated by commas.</w:t>
+        <w:t>3. The patient selects the data modules from Observation, Medication, Condition and Procedure, and sets the start and expiry times.</w:t>
       </w:r>
     </w:p>
     <w:p>
@@ -4110,7 +5197,18 @@
         <w:rPr>
           <w:color w:val="FF0000"/>
         </w:rPr>
-        <w:t>3. The patient selects the data modules from Observation, Medication, Condition and Procedure, and sets the start and expiry times.</w:t>
+        <w:t>4. The patient presses Initial Consent. The prototype checks that at least one guardian is listed, that the doctor DID holds a valid doctor credential, that each guardian DID holds a valid guardian credential, that no guardian appears twice, that the data scope is not empty and that the expiry time is later than the start time. If any check fails, an error message names the failed field and nothing is stored.</w:t>
+      </w:r>
+    </w:p>
+    <w:p>
+      <w:pPr>
+        <w:pStyle w:val="3"/>
+      </w:pPr>
+      <w:r>
+        <w:rPr>
+          <w:color w:val="FF0000"/>
+        </w:rPr>
+        <w:t>5.8.2 Steps in the service layer</w:t>
       </w:r>
     </w:p>
     <w:p>
@@ -4119,16 +5217,7 @@
         <w:rPr>
           <w:color w:val="FF0000"/>
         </w:rPr>
-        <w:t>4. The patient presses Initial Consent. The prototype checks that at least one guardian is listed, that the doctor DID holds a valid doctor credential, that each guardian DID holds a valid guardian credential, that no guardian appears twice, that the data scope is not empty and that the expiry time is later than the start time. If any check fails, an error message names the failed field and nothing is stored.</w:t>
-      </w:r>
-    </w:p>
-    <w:p>
-      <w:pPr/>
-      <w:r>
-        <w:rPr>
-          <w:color w:val="FF0000"/>
-        </w:rPr>
-        <w:t>5. If every check passes, the prototype assigns the consent identifier, stores the object in the state PENDING_SIGNATURE with N set to the number of guardians, writes the CREATE_CONSENT event to the audit ledger, and shows the identifier to the patient.</w:t>
+        <w:t>5. If every check passes, the service layer assigns the consent identifier, stores the object in the state PENDING_SIGNATURE with N set to the number of guardians, writes the CREATE_CONSENT event to the audit ledger, and returns the identifier to the interface, which shows it to the patient.</w:t>
       </w:r>
     </w:p>
     <w:p>
@@ -4200,7 +5289,7 @@
         <w:rPr>
           <w:color w:val="FF0000"/>
         </w:rPr>
-        <w:t>5.7 Validation and Evaluation</w:t>
+        <w:t>5.9 Prototype Evaluation and Discussion</w:t>
       </w:r>
     </w:p>
     <w:p>
@@ -4209,7 +5298,7 @@
         <w:rPr>
           <w:color w:val="FF0000"/>
         </w:rPr>
-        <w:t>RO1 is validated in two ways. First, the creation of the consent object is checked functionally: a valid specification must produce a consent object with all six components, and an invalid specification must be rejected before anything is stored. Second, the architecture is evaluated against the security properties it is designed to provide. The validation of the predicates that are evaluated against the consent object, VI, VA, VP, VT and VL, belongs to the chapters of RO2 to RO5, and the evaluation of the complete decision belongs to Chapter 10.</w:t>
+        <w:t>Objective one involves the representation of patient consent as an evaluable authorisation object. The results of the validation carried out for this objective are shown in Figure 5.8 and Table 5.4, and the evaluation of the architecture against its security properties is shown in Table 5.5. RO1 is validated in two ways. First, the creation of the consent object is checked functionally: a valid specification must produce a consent object with all six components, and an invalid specification must be rejected before anything is stored. Second, the architecture is evaluated against the security properties it is designed to provide. The validation of the predicates that are evaluated against the consent object, VI, VA, VP, VT and VL, belongs to the chapters of RO2 to RO5, and the evaluation of the complete decision belongs to Chapter 10.</w:t>
       </w:r>
     </w:p>
     <w:p>
@@ -4220,7 +5309,7 @@
         <w:rPr>
           <w:color w:val="FF0000"/>
         </w:rPr>
-        <w:t>5.7.1 Validation of Consent Creation</w:t>
+        <w:t>5.9.1 Validation of Consent Creation</w:t>
       </w:r>
     </w:p>
     <w:p>
@@ -4308,7 +5397,7 @@
         <w:rPr>
           <w:color w:val="FF0000"/>
         </w:rPr>
-        <w:t>Table 5.3 brings these results together by component of the consent object. For each component of C it gives the check that Algorithm 1 applies at creation, the evidence from the live runs and the automated tests, and the result observed.</w:t>
+        <w:t>Table 5.4 brings these results together by component of the consent object. For each component of C it gives the check that Algorithm 1 applies at creation, the evidence from the live runs and the automated tests, and the result observed.</w:t>
       </w:r>
     </w:p>
     <w:p>
@@ -4322,7 +5411,7 @@
           <w:color w:val="FF0000"/>
           <w:sz w:val="20"/>
         </w:rPr>
-        <w:t>Table 5.3: Evaluation of the trust-centric consent model: the check applied to each component of C at creation, the evidence and the result</w:t>
+        <w:t>Table 5.4: Evaluation of the trust-centric consent model: the check applied to each component of C at creation, the evidence and the result</w:t>
       </w:r>
     </w:p>
     <w:tbl>
@@ -5025,7 +6114,7 @@
                 <w:color w:val="FF0000"/>
                 <w:sz w:val="19"/>
               </w:rPr>
-              <w:t>Scenario 1 recorded a validity window ending on 31 December 2026; the prototype refuses an expiry time that is not later than the start time (Section 5.6.3).</w:t>
+              <w:t>Scenario 1 recorded a validity window ending on 31 December 2026; the prototype refuses an expiry time that is not later than the start time (Section 5.8).</w:t>
             </w:r>
           </w:p>
         </w:tc>
@@ -5355,7 +6444,7 @@
         <w:rPr>
           <w:color w:val="FF0000"/>
         </w:rPr>
-        <w:t>5.7.2 Evaluation of the Architecture against the Security Properties</w:t>
+        <w:t>5.9.2 Evaluation of the Architecture against the Security Properties</w:t>
       </w:r>
     </w:p>
     <w:p>
@@ -5373,7 +6462,7 @@
         <w:rPr>
           <w:color w:val="FF0000"/>
         </w:rPr>
-        <w:t>First, the architecture provides identity-dependent participation. A participant cannot contribute to the authorisation process solely by interacting with the system interface. The corresponding identity and credential must satisfy the verification requirements. Second, the architecture provides authority separation. Possession of a valid identity does not automatically result in permission to access patient data. Identity verification provides evidence concerning who an entity is, whereas authority verification determines whether that entity may perform a particular role within the authorisation process. Third, the architecture provides collective authorisation integrity. Sensitive healthcare data access can be configured to require multiple independently verified participants. Therefore, a single participant cannot unilaterally activate access when the defined authorisation threshold has not been reached. Fourth, the architecture provides policy-bounded access. A valid requester with sufficient approval evidence cannot access healthcare information beyond the purpose or data scope defined by the consent object. Finally, the architecture provides decision accountability. The system maintains evidence concerning the conditions that produced an authorisation decision, thereby supporting auditing and subsequent verification. These properties, together with the separation of interaction and enforcement established in Section 5.3, are summarised in Table 5.4, in which collective authorisation integrity and decision accountability appear as multi-party authorisation integrity and authorisation evidence respectively.</w:t>
+        <w:t>First, the architecture provides identity-dependent participation. A participant cannot contribute to the authorisation process solely by interacting with the system interface. The corresponding identity and credential must satisfy the verification requirements. Second, the architecture provides authority separation. Possession of a valid identity does not automatically result in permission to access patient data. Identity verification provides evidence concerning who an entity is, whereas authority verification determines whether that entity may perform a particular role within the authorisation process. Third, the architecture provides collective authorisation integrity. Sensitive healthcare data access can be configured to require multiple independently verified participants. Therefore, a single participant cannot unilaterally activate access when the defined authorisation threshold has not been reached. Fourth, the architecture provides policy-bounded access. A valid requester with sufficient approval evidence cannot access healthcare information beyond the purpose or data scope defined by the consent object. Finally, the architecture provides decision accountability. The system maintains evidence concerning the conditions that produced an authorisation decision, thereby supporting auditing and subsequent verification. These properties, together with the separation of interaction and enforcement established in Section 5.3, are summarised in Table 5.5, in which collective authorisation integrity and decision accountability appear as multi-party authorisation integrity and authorisation evidence respectively.</w:t>
       </w:r>
     </w:p>
     <w:p>
@@ -5387,7 +6476,7 @@
           <w:color w:val="FF0000"/>
           <w:sz w:val="20"/>
         </w:rPr>
-        <w:t>Table 5.4: Security properties supported by the proposed MVC-based consent architecture</w:t>
+        <w:t>Table 5.5: Security properties supported by the proposed MVC-based consent architecture</w:t>
       </w:r>
     </w:p>
     <w:tbl>
@@ -6184,7 +7273,36 @@
         <w:rPr>
           <w:color w:val="FF0000"/>
         </w:rPr>
-        <w:t>Each property in Table 5.4 is realised by a component of the architecture and tested in a later chapter. Identity-dependent participation and authority separation are tested in Chapter 6 through the credential checks and the forged-credential attack. Multi-party authorisation integrity is tested in Chapter 7 through the outside-signer, replayed-signature and duplicate-approval attacks. Policy-bounded access is tested in Chapter 8 through the over-scope and empty-scope attacks. Authorisation evidence is checked in every chapter through the audit ledger and in Chapter 10 through the recorded decisions. Separation of interaction and enforcement is the property that the hardening of 1 October 2026 made real: three attacks that the interface already blocked were also accepted by the service functions until the checks were moved into the Controller, as reported in Chapter 10. The architecture therefore does not claim security from MVC itself; it claims it from the placement of every trust-sensitive check inside the Controller, and the tests of the following chapters are the evidence for that claim.</w:t>
+        <w:t>Each property in Table 5.5 is realised by a component of the architecture and tested in a later chapter. Identity-dependent participation and authority separation are tested in Chapter 6 through the credential checks and the forged-credential attack. Multi-party authorisation integrity is tested in Chapter 7 through the outside-signer, replayed-signature and duplicate-approval attacks. Policy-bounded access is tested in Chapter 8 through the over-scope and empty-scope attacks. Authorisation evidence is checked in every chapter through the audit ledger and in Chapter 10 through the recorded decisions. Separation of interaction and enforcement is the property that the hardening of 1 October 2026 made real: three attacks that the interface already blocked were also accepted by the service functions until the checks were moved into the Controller, as reported in Chapter 10. The architecture therefore does not claim security from MVC itself; it claims it from the placement of every trust-sensitive check inside the Controller, and the tests of the following chapters are the evidence for that claim.</w:t>
+      </w:r>
+    </w:p>
+    <w:p>
+      <w:pPr>
+        <w:pStyle w:val="3"/>
+      </w:pPr>
+      <w:r>
+        <w:rPr>
+          <w:color w:val="FF0000"/>
+        </w:rPr>
+        <w:t>5.9.3 Discussion</w:t>
+      </w:r>
+    </w:p>
+    <w:p>
+      <w:pPr/>
+      <w:r>
+        <w:rPr>
+          <w:color w:val="FF0000"/>
+        </w:rPr>
+        <w:t>The use of the consent object for consent creation has several advantages which include completeness, rejection before storage, and evidence. Completeness means that a created consent carries every condition that the later checks need, so no check has to look for its condition outside the object. Rejection before storage means that an invalid specification leaves no record behind, so the store never holds a consent that cannot be evaluated. Evidence means that every creation is written to the audit ledger with its identifier, its participants and its time, so the later decisions can be traced back to the consent they were taken on.</w:t>
+      </w:r>
+    </w:p>
+    <w:p>
+      <w:pPr/>
+      <w:r>
+        <w:rPr>
+          <w:color w:val="FF0000"/>
+        </w:rPr>
+        <w:t>On the other hand, the trade-off is rigidity. A consent cannot be changed after it has been created, so a change of doctor, guardian or data scope requires a new consent, and the credentials of the doctor and of every guardian must have been issued before the consent can be created (see Chapter 6). In the current interface, the purpose is also fixed to Treatment. Although these may be considered limitations of the method, the certainty that every stored consent is complete and that every creation is recorded outweighs them at this stage, and consent modification is addressed in the next stage of the research (Chapter 9).</w:t>
       </w:r>
     </w:p>
     <w:p>
@@ -6195,7 +7313,7 @@
         <w:rPr>
           <w:color w:val="FF0000"/>
         </w:rPr>
-        <w:t>5.8 Conclusion</w:t>
+        <w:t>5.10 Conclusion</w:t>
       </w:r>
     </w:p>
     <w:p>
@@ -6204,7 +7322,25 @@
         <w:rPr>
           <w:color w:val="FF0000"/>
         </w:rPr>
-        <w:t>This chapter presented the research architecture and the trust-centric consent model. The architecture separates the interaction of independent stakeholders in the View, the enforcement of the five trust predicates in the Controller, and the representation of consent, identity, approval, policy, evidence and lifecycle state in the Model, with the protected health data outside all three layers. The consent model represents patient consent as the evaluable object C = (I, A, P, T, L, E), created through Algorithm 1 only when every field is valid, assigned a unique identifier, persisted in the state PENDING_SIGNATURE and recorded in the audit ledger. The prototype implements the model in the patient interface, the live scenarios and the automated tests show that valid specifications are created and invalid ones are rejected, and the architecture was evaluated against the six security properties it is designed to provide. The next chapter presents the solution for RO2, which verifies who the participants are and what authority they hold.</w:t>
+        <w:t>In this chapter, we discussed the research architecture on which the whole framework is built. In particular, we discussed the three layers of the architecture, where trust is evaluated and where the boundaries between the layers lie, and how the architecture maps to the six research objectives. In addition, we proposed a model to represent patient consent as the evaluable object C = (I, A, P, T, L, E), created through Algorithm 1 only when every field is valid, assigned a unique identifier, persisted in the state PENDING_SIGNATURE and recorded in the audit ledger. This addressed the first research objective of this thesis.</w:t>
+      </w:r>
+    </w:p>
+    <w:p>
+      <w:pPr/>
+      <w:r>
+        <w:rPr>
+          <w:color w:val="FF0000"/>
+        </w:rPr>
+        <w:t>In this chapter we also presented the prototype used for validating the solution to research objective 1. This was done using a public synthetic dataset. At the end of the validation process, the results show that valid specifications are created with all six components and that invalid ones are rejected before anything is stored, and the architecture was evaluated against the six security properties it is designed to provide. However, a key finding from the validation was that a consent cannot be changed once it has been created; the users of HALAH will have to create a new consent when its terms change.</w:t>
+      </w:r>
+    </w:p>
+    <w:p>
+      <w:pPr/>
+      <w:r>
+        <w:rPr>
+          <w:color w:val="FF0000"/>
+        </w:rPr>
+        <w:t>The next chapter will discuss in a methodological manner the steps involved in verifying who the participants are and what authority they hold, which is the solution for research objective 2.</w:t>
       </w:r>
     </w:p>
     <w:sectPr>

</xml_diff>

<commit_message>
Thesis Chapter 5: shorter figure captions
Co-Authored-By: Claude Fable 5.1 <noreply@anthropic.com>
Claude-Session: https://claude.ai/code/session_01QHSSv245Aernyaebt7V5kS
</commit_message>
<xml_diff>
--- a/docs/Yasir_Thesis_Chapter5.docx
+++ b/docs/Yasir_Thesis_Chapter5.docx
@@ -639,37 +639,15 @@
           <w:sz w:val="20"/>
           <w:szCs w:val="18"/>
         </w:rPr>
-        <w:t>Trust predicate evaluation and authorisation decision flow (in the current prototype, V</w:t>
-      </w:r>
-      <w:r>
-        <w:rPr>
+        <w:t>Trust predicate evaluation and authorisation decision flow</w:t>
+      </w:r>
+      <w:r>
+        <w:rPr>
+          <w:color w:val="FF0000"/>
           <w:sz w:val="20"/>
           <w:szCs w:val="18"/>
-          <w:vertAlign w:val="subscript"/>
-        </w:rPr>
-        <w:t>I</w:t>
-      </w:r>
-      <w:r>
-        <w:rPr>
-          <w:sz w:val="20"/>
-          <w:szCs w:val="18"/>
-        </w:rPr>
-        <w:t xml:space="preserve"> also checks the EIP-712 signature of each listed guardian, and a refusal for a consent that is not ACTIVE is recorded in the audit ledger like any other refusal, while the check labelled VL in the prototype interface is the exploratory jurisdiction check V</w:t>
-      </w:r>
-      <w:r>
-        <w:rPr>
-          <w:sz w:val="20"/>
-          <w:szCs w:val="18"/>
-          <w:vertAlign w:val="subscript"/>
-        </w:rPr>
-        <w:t>J</w:t>
-      </w:r>
-      <w:r>
-        <w:rPr>
-          <w:sz w:val="20"/>
-          <w:szCs w:val="18"/>
-        </w:rPr>
-        <w:t>).</w:t>
+        </w:rPr>
+        <w:t>.</w:t>
       </w:r>
     </w:p>
     <w:p>
@@ -752,7 +730,15 @@
           <w:sz w:val="20"/>
           <w:szCs w:val="18"/>
         </w:rPr>
-        <w:t>The four gates that an access request passes before data are released: identity (DID), authority (VC and signed approval), collective approval (threshold), and validity of the consent for the request (policy, time, lifecycle and the zero-knowledge proof). Each gate names what the current prototype checks, and a failure at any gate produces DENY. The prototype records the decision matrix in the audit ledger for every request, including one against a consent that is not ACTIVE.</w:t>
+        <w:t>The four gates that an access request passes before data are released</w:t>
+      </w:r>
+      <w:r>
+        <w:rPr>
+          <w:color w:val="FF0000"/>
+          <w:sz w:val="20"/>
+          <w:szCs w:val="18"/>
+        </w:rPr>
+        <w:t>.</w:t>
       </w:r>
     </w:p>
     <w:p>
@@ -3044,18 +3030,11 @@
           <w:sz w:val="20"/>
           <w:szCs w:val="18"/>
         </w:rPr>
-        <w:t xml:space="preserve">Six-component consent model C = (I, A, P, T, L, E) with the content and supplier of each component, where L is the lifecycle state. The states shown are those of the design, and the states implemented in the prototype are </w:t>
+        <w:t>Six-component consent model C = (I, A, P, T, L, E)</w:t>
       </w:r>
       <w:r>
         <w:rPr>
           <w:color w:val="FF0000"/>
-          <w:sz w:val="20"/>
-          <w:szCs w:val="18"/>
-        </w:rPr>
-        <w:t>given in Chapter 9</w:t>
-      </w:r>
-      <w:r>
-        <w:rPr>
           <w:sz w:val="20"/>
           <w:szCs w:val="18"/>
         </w:rPr>
@@ -5278,7 +5257,7 @@
           <w:color w:val="FF0000"/>
           <w:sz w:val="20"/>
         </w:rPr>
-        <w:t>Figure 5.7: The patient interface of the HALAH prototype after a consent has been created: the consent specification on the left and right, and the confirmation with the consent identifier below.</w:t>
+        <w:t>Figure 5.7: The patient interface of the HALAH prototype after a consent has been created.</w:t>
       </w:r>
     </w:p>
     <w:p>

</xml_diff>

<commit_message>
Chapter 5: RO1 result stated as the conceptual model; one-line caption for the validation table (thesis and report)
Co-Authored-By: Claude Fable 5.1 <noreply@anthropic.com>
Claude-Session: https://claude.ai/code/session_01QHSSv245Aernyaebt7V5kS
</commit_message>
<xml_diff>
--- a/docs/Yasir_Thesis_Chapter5.docx
+++ b/docs/Yasir_Thesis_Chapter5.docx
@@ -5277,7 +5277,7 @@
         <w:rPr>
           <w:color w:val="FF0000"/>
         </w:rPr>
-        <w:t>Objective one involves the representation of patient consent as an evaluable authorisation object. The results of the validation carried out for this objective are shown in Figure 5.8 and Table 5.4, and the evaluation of the architecture against its security properties is shown in Table 5.5. RO1 is validated in two ways. First, the creation of the consent object is checked functionally: a valid specification must produce a consent object with all six components, and an invalid specification must be rejected before anything is stored. Second, the architecture is evaluated against the security properties it is designed to provide. The validation of the predicates that are evaluated against the consent object, VI, VA, VP, VT and VL, belongs to the chapters of RO2 to RO5, and the evaluation of the complete decision belongs to Chapter 10.</w:t>
+        <w:t>Objective one involves the representation of patient consent as an evaluable authorisation object. The result of RO1 is therefore the conceptual model of Sections 5.2 to 5.5, not a set of measurements. The prototype results reported in this section show only that the model can be realised and behaves as specified, so they are reported as outcomes, created or rejected, rather than as numbers; the quantitative evaluation of the complete framework is given in Chapter 10. The results of the validation carried out for this objective are shown in Figure 5.8 and Table 5.4, and the security properties of the architecture are examined in Table 5.5. RO1 is validated in two ways. First, the creation of the consent object is checked functionally: a valid specification must produce a consent object with all six components, and an invalid specification must be rejected before anything is stored. Second, the architecture is evaluated against the security properties it is designed to provide. The validation of the predicates that are evaluated against the consent object, VI, VA, VP, VT and VL, belongs to the chapters of RO2 to RO5, and the evaluation of the complete decision belongs to Chapter 10.</w:t>
       </w:r>
     </w:p>
     <w:p>
@@ -5390,7 +5390,7 @@
           <w:color w:val="FF0000"/>
           <w:sz w:val="20"/>
         </w:rPr>
-        <w:t>Table 5.4: Evaluation of the trust-centric consent model: the check applied to each component of C at creation, the evidence and the result</w:t>
+        <w:t>Table 5.4: Validation results of the prototype for consent creation</w:t>
       </w:r>
     </w:p>
     <w:tbl>

</xml_diff>

<commit_message>
Thesis Chapter 5: access decision and refusal equations (5.1, 5.2) in Section 5.3; consent object renumbered to 5.3
Co-Authored-By: Claude Fable 5.1 <noreply@anthropic.com>
Claude-Session: https://claude.ai/code/session_01QHSSv245Aernyaebt7V5kS
</commit_message>
<xml_diff>
--- a/docs/Yasir_Thesis_Chapter5.docx
+++ b/docs/Yasir_Thesis_Chapter5.docx
@@ -572,6 +572,79 @@
       </w:r>
       <w:r>
         <w:t>.</w:t>
+      </w:r>
+    </w:p>
+    <w:p>
+      <w:pPr/>
+      <w:r>
+        <w:rPr>
+          <w:color w:val="FF0000"/>
+        </w:rPr>
+        <w:t>Taken together, these five conditions give the access decision of the framework, which Equation (5.1) states: a request is allowed only when every condition holds at the time of the request. Conversely, the failure of any one condition is sufficient for refusal, as Equation (5.2) states, and the success of the other conditions cannot compensate for it.</w:t>
+      </w:r>
+    </w:p>
+    <w:p>
+      <w:pPr>
+        <w:keepLines/>
+        <w:tabs>
+          <w:tab w:val="center" w:pos="4564"/>
+          <w:tab w:val="right" w:pos="9128"/>
+        </w:tabs>
+        <w:spacing w:before="80" w:after="160"/>
+      </w:pPr>
+      <w:r>
+        <w:rPr>
+          <w:color w:val="FF0000"/>
+        </w:rPr>
+        <w:tab/>
+      </w:r>
+      <w:r>
+        <w:rPr>
+          <w:rFonts w:ascii="Cambria Math" w:eastAsia="Cambria Math" w:hAnsi="Cambria Math" w:cs="Cambria Math"/>
+          <w:color w:val="FF0000"/>
+          <w:sz w:val="21"/>
+          <w:szCs w:val="21"/>
+        </w:rPr>
+        <w:t>Decision(C, R, t) = ALLOW ⟺ VI(u) ∧ VA(C) ∧ VP(C, R) ∧ VT(C, t) ∧ VL(C).</w:t>
+      </w:r>
+      <w:r>
+        <w:rPr>
+          <w:color w:val="FF0000"/>
+        </w:rPr>
+        <w:tab/>
+        <w:t>(5.1)</w:t>
+      </w:r>
+    </w:p>
+    <w:p>
+      <w:pPr>
+        <w:keepLines/>
+        <w:tabs>
+          <w:tab w:val="center" w:pos="4564"/>
+          <w:tab w:val="right" w:pos="9128"/>
+        </w:tabs>
+        <w:spacing w:before="80" w:after="160"/>
+      </w:pPr>
+      <w:r>
+        <w:rPr>
+          <w:color w:val="FF0000"/>
+        </w:rPr>
+        <w:tab/>
+      </w:r>
+      <w:r>
+        <w:rPr>
+          <w:rFonts w:ascii="Cambria Math" w:eastAsia="Cambria Math" w:hAnsi="Cambria Math" w:cs="Cambria Math"/>
+          <w:color w:val="FF0000"/>
+          <w:sz w:val="21"/>
+          <w:szCs w:val="21"/>
+        </w:rPr>
+        <w:t>¬(VI ∧ VA ∧ VP ∧ VT ∧ VL) ⟹ Decision(C, R, t) = DENY.</w:t>
+      </w:r>
+      <w:r>
+        <w:rPr>
+          <w:color w:val="FF0000"/>
+        </w:rPr>
+        <w:tab/>
+        <w:t>(5.2)</w:t>
       </w:r>
     </w:p>
     <w:p>
@@ -2750,7 +2823,7 @@
         <w:rPr>
           <w:color w:val="FF0000"/>
         </w:rPr>
-        <w:t>Equation (5.1)</w:t>
+        <w:t>Equation (5.3)</w:t>
       </w:r>
       <w:r>
         <w:t>.</w:t>
@@ -2783,7 +2856,7 @@
         <w:rPr>
           <w:color w:val="FF0000"/>
         </w:rPr>
-        <w:t>(5.1)</w:t>
+        <w:t>(5.3)</w:t>
       </w:r>
     </w:p>
     <w:p>
@@ -2795,7 +2868,7 @@
         <w:rPr>
           <w:color w:val="FF0000"/>
         </w:rPr>
-        <w:t>In Equation (5.1)</w:t>
+        <w:t>In Equation (5.3)</w:t>
       </w:r>
       <w:r>
         <w:t xml:space="preserve">, I represents patient and participant identity information, A represents authorisation requirements, P represents policy constraints, and E represents authorisation evidence. T represents the temporal validity window, and L represents the current state of the consent object and its permissible transitions. </w:t>

</xml_diff>

<commit_message>
Thesis Chapter 5: the integrated decision now cites Equation 5.1 inside the chapter
Co-Authored-By: Claude Fable 5.1 <noreply@anthropic.com>
Claude-Session: https://claude.ai/code/session_01QHSSv245Aernyaebt7V5kS
</commit_message>
<xml_diff>
--- a/docs/Yasir_Thesis_Chapter5.docx
+++ b/docs/Yasir_Thesis_Chapter5.docx
@@ -535,7 +535,16 @@
         <w:t>L</w:t>
       </w:r>
       <w:r>
-        <w:t>(C), determines whether the consent remains in a valid lifecycle state. The integrated decision can therefore be expressed as Equation (3.2). In the current prototype, the Consent Engine derives the lifecycle state, a request proceeds only when this state is ACTIVE, and the revocation flag and the token are also checked within V</w:t>
+        <w:t xml:space="preserve">(C), determines whether the consent remains in a valid lifecycle state. The integrated decision </w:t>
+      </w:r>
+      <w:r>
+        <w:rPr>
+          <w:color w:val="FF0000"/>
+        </w:rPr>
+        <w:t>can therefore be expressed as Equation (5.1)</w:t>
+      </w:r>
+      <w:r>
+        <w:t>. In the current prototype, the Consent Engine derives the lifecycle state, a request proceeds only when this state is ACTIVE, and the revocation flag and the token are also checked within V</w:t>
       </w:r>
       <w:r>
         <w:rPr>
@@ -580,7 +589,7 @@
         <w:rPr>
           <w:color w:val="FF0000"/>
         </w:rPr>
-        <w:t>Taken together, these five conditions give the access decision of the framework, which Equation (5.1) states: a request is allowed only when every condition holds at the time of the request. Conversely, the failure of any one condition is sufficient for refusal, as Equation (5.2) states, and the success of the other conditions cannot compensate for it.</w:t>
+        <w:t>Equation (5.1) states that a request is allowed only when every one of the five conditions holds at the time of the request. Conversely, the failure of any one condition is sufficient for refusal, as Equation (5.2) states, and the success of the other conditions cannot compensate for it.</w:t>
       </w:r>
     </w:p>
     <w:p>

</xml_diff>

<commit_message>
Thesis Chapter 5 review copy: latest equation changes highlighted in yellow
Co-Authored-By: Claude Fable 5.1 <noreply@anthropic.com>
Claude-Session: https://claude.ai/code/session_01QHSSv245Aernyaebt7V5kS
</commit_message>
<xml_diff>
--- a/docs/Yasir_Thesis_Chapter5.docx
+++ b/docs/Yasir_Thesis_Chapter5.docx
@@ -540,6 +540,7 @@
       <w:r>
         <w:rPr>
           <w:color w:val="FF0000"/>
+          <w:highlight w:val="yellow"/>
         </w:rPr>
         <w:t>can therefore be expressed as Equation (5.1)</w:t>
       </w:r>
@@ -588,6 +589,7 @@
       <w:r>
         <w:rPr>
           <w:color w:val="FF0000"/>
+          <w:highlight w:val="yellow"/>
         </w:rPr>
         <w:t>Equation (5.1) states that a request is allowed only when every one of the five conditions holds at the time of the request. Conversely, the failure of any one condition is sufficient for refusal, as Equation (5.2) states, and the success of the other conditions cannot compensate for it.</w:t>
       </w:r>
@@ -604,6 +606,7 @@
       <w:r>
         <w:rPr>
           <w:color w:val="FF0000"/>
+          <w:highlight w:val="yellow"/>
         </w:rPr>
         <w:tab/>
       </w:r>
@@ -613,12 +616,14 @@
           <w:color w:val="FF0000"/>
           <w:sz w:val="21"/>
           <w:szCs w:val="21"/>
+          <w:highlight w:val="yellow"/>
         </w:rPr>
         <w:t>Decision(C, R, t) = ALLOW ⟺ VI(u) ∧ VA(C) ∧ VP(C, R) ∧ VT(C, t) ∧ VL(C).</w:t>
       </w:r>
       <w:r>
         <w:rPr>
           <w:color w:val="FF0000"/>
+          <w:highlight w:val="yellow"/>
         </w:rPr>
         <w:tab/>
         <w:t>(5.1)</w:t>
@@ -636,6 +641,7 @@
       <w:r>
         <w:rPr>
           <w:color w:val="FF0000"/>
+          <w:highlight w:val="yellow"/>
         </w:rPr>
         <w:tab/>
       </w:r>
@@ -645,12 +651,14 @@
           <w:color w:val="FF0000"/>
           <w:sz w:val="21"/>
           <w:szCs w:val="21"/>
+          <w:highlight w:val="yellow"/>
         </w:rPr>
         <w:t>¬(VI ∧ VA ∧ VP ∧ VT ∧ VL) ⟹ Decision(C, R, t) = DENY.</w:t>
       </w:r>
       <w:r>
         <w:rPr>
           <w:color w:val="FF0000"/>
+          <w:highlight w:val="yellow"/>
         </w:rPr>
         <w:tab/>
         <w:t>(5.2)</w:t>
@@ -2831,6 +2839,7 @@
       <w:r>
         <w:rPr>
           <w:color w:val="FF0000"/>
+          <w:highlight w:val="yellow"/>
         </w:rPr>
         <w:t>Equation (5.3)</w:t>
       </w:r>
@@ -2864,6 +2873,7 @@
       <w:r>
         <w:rPr>
           <w:color w:val="FF0000"/>
+          <w:highlight w:val="yellow"/>
         </w:rPr>
         <w:t>(5.3)</w:t>
       </w:r>
@@ -2876,6 +2886,7 @@
       <w:r>
         <w:rPr>
           <w:color w:val="FF0000"/>
+          <w:highlight w:val="yellow"/>
         </w:rPr>
         <w:t>In Equation (5.3)</w:t>
       </w:r>

</xml_diff>

<commit_message>
Thesis Chapter 5: equations 5.1 and 5.2 use the subscript notation of the other chapters
Co-Authored-By: Claude Fable 5.1 <noreply@anthropic.com>
Claude-Session: https://claude.ai/code/session_01QHSSv245Aernyaebt7V5kS
</commit_message>
<xml_diff>
--- a/docs/Yasir_Thesis_Chapter5.docx
+++ b/docs/Yasir_Thesis_Chapter5.docx
@@ -612,13 +612,85 @@
       </w:r>
       <w:r>
         <w:rPr>
-          <w:rFonts w:ascii="Cambria Math" w:eastAsia="Cambria Math" w:hAnsi="Cambria Math" w:cs="Cambria Math"/>
-          <w:color w:val="FF0000"/>
-          <w:sz w:val="21"/>
-          <w:szCs w:val="21"/>
+          <w:color w:val="FF0000"/>
           <w:highlight w:val="yellow"/>
         </w:rPr>
-        <w:t>Decision(C, R, t) = ALLOW ⟺ VI(u) ∧ VA(C) ∧ VP(C, R) ∧ VT(C, t) ∧ VL(C).</w:t>
+        <w:t>Decision(C, R, t) = ALLOW ⟺ V</w:t>
+      </w:r>
+      <w:r>
+        <w:rPr>
+          <w:color w:val="FF0000"/>
+          <w:highlight w:val="yellow"/>
+          <w:vertAlign w:val="subscript"/>
+        </w:rPr>
+        <w:t>I</w:t>
+      </w:r>
+      <w:r>
+        <w:rPr>
+          <w:color w:val="FF0000"/>
+          <w:highlight w:val="yellow"/>
+        </w:rPr>
+        <w:t>(u) ∧ V</w:t>
+      </w:r>
+      <w:r>
+        <w:rPr>
+          <w:color w:val="FF0000"/>
+          <w:highlight w:val="yellow"/>
+          <w:vertAlign w:val="subscript"/>
+        </w:rPr>
+        <w:t>A</w:t>
+      </w:r>
+      <w:r>
+        <w:rPr>
+          <w:color w:val="FF0000"/>
+          <w:highlight w:val="yellow"/>
+        </w:rPr>
+        <w:t>(C) ∧ V</w:t>
+      </w:r>
+      <w:r>
+        <w:rPr>
+          <w:color w:val="FF0000"/>
+          <w:highlight w:val="yellow"/>
+          <w:vertAlign w:val="subscript"/>
+        </w:rPr>
+        <w:t>P</w:t>
+      </w:r>
+      <w:r>
+        <w:rPr>
+          <w:color w:val="FF0000"/>
+          <w:highlight w:val="yellow"/>
+        </w:rPr>
+        <w:t>(C, R) ∧ V</w:t>
+      </w:r>
+      <w:r>
+        <w:rPr>
+          <w:color w:val="FF0000"/>
+          <w:highlight w:val="yellow"/>
+          <w:vertAlign w:val="subscript"/>
+        </w:rPr>
+        <w:t>T</w:t>
+      </w:r>
+      <w:r>
+        <w:rPr>
+          <w:color w:val="FF0000"/>
+          <w:highlight w:val="yellow"/>
+        </w:rPr>
+        <w:t>(C, t) ∧ V</w:t>
+      </w:r>
+      <w:r>
+        <w:rPr>
+          <w:color w:val="FF0000"/>
+          <w:highlight w:val="yellow"/>
+          <w:vertAlign w:val="subscript"/>
+        </w:rPr>
+        <w:t>L</w:t>
+      </w:r>
+      <w:r>
+        <w:rPr>
+          <w:color w:val="FF0000"/>
+          <w:highlight w:val="yellow"/>
+        </w:rPr>
+        <w:t>(C).</w:t>
       </w:r>
       <w:r>
         <w:rPr>
@@ -647,13 +719,85 @@
       </w:r>
       <w:r>
         <w:rPr>
-          <w:rFonts w:ascii="Cambria Math" w:eastAsia="Cambria Math" w:hAnsi="Cambria Math" w:cs="Cambria Math"/>
-          <w:color w:val="FF0000"/>
-          <w:sz w:val="21"/>
-          <w:szCs w:val="21"/>
+          <w:color w:val="FF0000"/>
           <w:highlight w:val="yellow"/>
         </w:rPr>
-        <w:t>¬(VI ∧ VA ∧ VP ∧ VT ∧ VL) ⟹ Decision(C, R, t) = DENY.</w:t>
+        <w:t>¬(V</w:t>
+      </w:r>
+      <w:r>
+        <w:rPr>
+          <w:color w:val="FF0000"/>
+          <w:highlight w:val="yellow"/>
+          <w:vertAlign w:val="subscript"/>
+        </w:rPr>
+        <w:t>I</w:t>
+      </w:r>
+      <w:r>
+        <w:rPr>
+          <w:color w:val="FF0000"/>
+          <w:highlight w:val="yellow"/>
+        </w:rPr>
+        <w:t xml:space="preserve"> ∧ V</w:t>
+      </w:r>
+      <w:r>
+        <w:rPr>
+          <w:color w:val="FF0000"/>
+          <w:highlight w:val="yellow"/>
+          <w:vertAlign w:val="subscript"/>
+        </w:rPr>
+        <w:t>A</w:t>
+      </w:r>
+      <w:r>
+        <w:rPr>
+          <w:color w:val="FF0000"/>
+          <w:highlight w:val="yellow"/>
+        </w:rPr>
+        <w:t xml:space="preserve"> ∧ V</w:t>
+      </w:r>
+      <w:r>
+        <w:rPr>
+          <w:color w:val="FF0000"/>
+          <w:highlight w:val="yellow"/>
+          <w:vertAlign w:val="subscript"/>
+        </w:rPr>
+        <w:t>P</w:t>
+      </w:r>
+      <w:r>
+        <w:rPr>
+          <w:color w:val="FF0000"/>
+          <w:highlight w:val="yellow"/>
+        </w:rPr>
+        <w:t xml:space="preserve"> ∧ V</w:t>
+      </w:r>
+      <w:r>
+        <w:rPr>
+          <w:color w:val="FF0000"/>
+          <w:highlight w:val="yellow"/>
+          <w:vertAlign w:val="subscript"/>
+        </w:rPr>
+        <w:t>T</w:t>
+      </w:r>
+      <w:r>
+        <w:rPr>
+          <w:color w:val="FF0000"/>
+          <w:highlight w:val="yellow"/>
+        </w:rPr>
+        <w:t xml:space="preserve"> ∧ V</w:t>
+      </w:r>
+      <w:r>
+        <w:rPr>
+          <w:color w:val="FF0000"/>
+          <w:highlight w:val="yellow"/>
+          <w:vertAlign w:val="subscript"/>
+        </w:rPr>
+        <w:t>L</w:t>
+      </w:r>
+      <w:r>
+        <w:rPr>
+          <w:color w:val="FF0000"/>
+          <w:highlight w:val="yellow"/>
+        </w:rPr>
+        <w:t>) ⟹ Decision(C, R, t) = DENY.</w:t>
       </w:r>
       <w:r>
         <w:rPr>

</xml_diff>

<commit_message>
Thesis Chapter 5: equations 5.1 and 5.2 set in the report's equation font and size
Co-Authored-By: Claude Fable 5.1 <noreply@anthropic.com>
Claude-Session: https://claude.ai/code/session_01QHSSv245Aernyaebt7V5kS
</commit_message>
<xml_diff>
--- a/docs/Yasir_Thesis_Chapter5.docx
+++ b/docs/Yasir_Thesis_Chapter5.docx
@@ -612,14 +612,18 @@
       </w:r>
       <w:r>
         <w:rPr>
-          <w:color w:val="FF0000"/>
+          <w:rFonts w:ascii="Cambria Math" w:hAnsi="Cambria Math" w:cs="Cambria Math" w:eastAsia="Cambria Math"/>
+          <w:color w:val="FF0000"/>
+          <w:sz w:val="18"/>
           <w:highlight w:val="yellow"/>
         </w:rPr>
         <w:t>Decision(C, R, t) = ALLOW ⟺ V</w:t>
       </w:r>
       <w:r>
         <w:rPr>
-          <w:color w:val="FF0000"/>
+          <w:rFonts w:ascii="Cambria Math" w:hAnsi="Cambria Math" w:cs="Cambria Math" w:eastAsia="Cambria Math"/>
+          <w:color w:val="FF0000"/>
+          <w:sz w:val="18"/>
           <w:highlight w:val="yellow"/>
           <w:vertAlign w:val="subscript"/>
         </w:rPr>
@@ -627,14 +631,18 @@
       </w:r>
       <w:r>
         <w:rPr>
-          <w:color w:val="FF0000"/>
+          <w:rFonts w:ascii="Cambria Math" w:hAnsi="Cambria Math" w:cs="Cambria Math" w:eastAsia="Cambria Math"/>
+          <w:color w:val="FF0000"/>
+          <w:sz w:val="18"/>
           <w:highlight w:val="yellow"/>
         </w:rPr>
         <w:t>(u) ∧ V</w:t>
       </w:r>
       <w:r>
         <w:rPr>
-          <w:color w:val="FF0000"/>
+          <w:rFonts w:ascii="Cambria Math" w:hAnsi="Cambria Math" w:cs="Cambria Math" w:eastAsia="Cambria Math"/>
+          <w:color w:val="FF0000"/>
+          <w:sz w:val="18"/>
           <w:highlight w:val="yellow"/>
           <w:vertAlign w:val="subscript"/>
         </w:rPr>
@@ -642,14 +650,18 @@
       </w:r>
       <w:r>
         <w:rPr>
-          <w:color w:val="FF0000"/>
+          <w:rFonts w:ascii="Cambria Math" w:hAnsi="Cambria Math" w:cs="Cambria Math" w:eastAsia="Cambria Math"/>
+          <w:color w:val="FF0000"/>
+          <w:sz w:val="18"/>
           <w:highlight w:val="yellow"/>
         </w:rPr>
         <w:t>(C) ∧ V</w:t>
       </w:r>
       <w:r>
         <w:rPr>
-          <w:color w:val="FF0000"/>
+          <w:rFonts w:ascii="Cambria Math" w:hAnsi="Cambria Math" w:cs="Cambria Math" w:eastAsia="Cambria Math"/>
+          <w:color w:val="FF0000"/>
+          <w:sz w:val="18"/>
           <w:highlight w:val="yellow"/>
           <w:vertAlign w:val="subscript"/>
         </w:rPr>
@@ -657,14 +669,18 @@
       </w:r>
       <w:r>
         <w:rPr>
-          <w:color w:val="FF0000"/>
+          <w:rFonts w:ascii="Cambria Math" w:hAnsi="Cambria Math" w:cs="Cambria Math" w:eastAsia="Cambria Math"/>
+          <w:color w:val="FF0000"/>
+          <w:sz w:val="18"/>
           <w:highlight w:val="yellow"/>
         </w:rPr>
         <w:t>(C, R) ∧ V</w:t>
       </w:r>
       <w:r>
         <w:rPr>
-          <w:color w:val="FF0000"/>
+          <w:rFonts w:ascii="Cambria Math" w:hAnsi="Cambria Math" w:cs="Cambria Math" w:eastAsia="Cambria Math"/>
+          <w:color w:val="FF0000"/>
+          <w:sz w:val="18"/>
           <w:highlight w:val="yellow"/>
           <w:vertAlign w:val="subscript"/>
         </w:rPr>
@@ -672,14 +688,18 @@
       </w:r>
       <w:r>
         <w:rPr>
-          <w:color w:val="FF0000"/>
+          <w:rFonts w:ascii="Cambria Math" w:hAnsi="Cambria Math" w:cs="Cambria Math" w:eastAsia="Cambria Math"/>
+          <w:color w:val="FF0000"/>
+          <w:sz w:val="18"/>
           <w:highlight w:val="yellow"/>
         </w:rPr>
         <w:t>(C, t) ∧ V</w:t>
       </w:r>
       <w:r>
         <w:rPr>
-          <w:color w:val="FF0000"/>
+          <w:rFonts w:ascii="Cambria Math" w:hAnsi="Cambria Math" w:cs="Cambria Math" w:eastAsia="Cambria Math"/>
+          <w:color w:val="FF0000"/>
+          <w:sz w:val="18"/>
           <w:highlight w:val="yellow"/>
           <w:vertAlign w:val="subscript"/>
         </w:rPr>
@@ -687,7 +707,9 @@
       </w:r>
       <w:r>
         <w:rPr>
-          <w:color w:val="FF0000"/>
+          <w:rFonts w:ascii="Cambria Math" w:hAnsi="Cambria Math" w:cs="Cambria Math" w:eastAsia="Cambria Math"/>
+          <w:color w:val="FF0000"/>
+          <w:sz w:val="18"/>
           <w:highlight w:val="yellow"/>
         </w:rPr>
         <w:t>(C).</w:t>
@@ -719,14 +741,18 @@
       </w:r>
       <w:r>
         <w:rPr>
-          <w:color w:val="FF0000"/>
+          <w:rFonts w:ascii="Cambria Math" w:hAnsi="Cambria Math" w:cs="Cambria Math" w:eastAsia="Cambria Math"/>
+          <w:color w:val="FF0000"/>
+          <w:sz w:val="18"/>
           <w:highlight w:val="yellow"/>
         </w:rPr>
         <w:t>¬(V</w:t>
       </w:r>
       <w:r>
         <w:rPr>
-          <w:color w:val="FF0000"/>
+          <w:rFonts w:ascii="Cambria Math" w:hAnsi="Cambria Math" w:cs="Cambria Math" w:eastAsia="Cambria Math"/>
+          <w:color w:val="FF0000"/>
+          <w:sz w:val="18"/>
           <w:highlight w:val="yellow"/>
           <w:vertAlign w:val="subscript"/>
         </w:rPr>
@@ -734,14 +760,18 @@
       </w:r>
       <w:r>
         <w:rPr>
-          <w:color w:val="FF0000"/>
+          <w:rFonts w:ascii="Cambria Math" w:hAnsi="Cambria Math" w:cs="Cambria Math" w:eastAsia="Cambria Math"/>
+          <w:color w:val="FF0000"/>
+          <w:sz w:val="18"/>
           <w:highlight w:val="yellow"/>
         </w:rPr>
         <w:t xml:space="preserve"> ∧ V</w:t>
       </w:r>
       <w:r>
         <w:rPr>
-          <w:color w:val="FF0000"/>
+          <w:rFonts w:ascii="Cambria Math" w:hAnsi="Cambria Math" w:cs="Cambria Math" w:eastAsia="Cambria Math"/>
+          <w:color w:val="FF0000"/>
+          <w:sz w:val="18"/>
           <w:highlight w:val="yellow"/>
           <w:vertAlign w:val="subscript"/>
         </w:rPr>
@@ -749,14 +779,18 @@
       </w:r>
       <w:r>
         <w:rPr>
-          <w:color w:val="FF0000"/>
+          <w:rFonts w:ascii="Cambria Math" w:hAnsi="Cambria Math" w:cs="Cambria Math" w:eastAsia="Cambria Math"/>
+          <w:color w:val="FF0000"/>
+          <w:sz w:val="18"/>
           <w:highlight w:val="yellow"/>
         </w:rPr>
         <w:t xml:space="preserve"> ∧ V</w:t>
       </w:r>
       <w:r>
         <w:rPr>
-          <w:color w:val="FF0000"/>
+          <w:rFonts w:ascii="Cambria Math" w:hAnsi="Cambria Math" w:cs="Cambria Math" w:eastAsia="Cambria Math"/>
+          <w:color w:val="FF0000"/>
+          <w:sz w:val="18"/>
           <w:highlight w:val="yellow"/>
           <w:vertAlign w:val="subscript"/>
         </w:rPr>
@@ -764,14 +798,18 @@
       </w:r>
       <w:r>
         <w:rPr>
-          <w:color w:val="FF0000"/>
+          <w:rFonts w:ascii="Cambria Math" w:hAnsi="Cambria Math" w:cs="Cambria Math" w:eastAsia="Cambria Math"/>
+          <w:color w:val="FF0000"/>
+          <w:sz w:val="18"/>
           <w:highlight w:val="yellow"/>
         </w:rPr>
         <w:t xml:space="preserve"> ∧ V</w:t>
       </w:r>
       <w:r>
         <w:rPr>
-          <w:color w:val="FF0000"/>
+          <w:rFonts w:ascii="Cambria Math" w:hAnsi="Cambria Math" w:cs="Cambria Math" w:eastAsia="Cambria Math"/>
+          <w:color w:val="FF0000"/>
+          <w:sz w:val="18"/>
           <w:highlight w:val="yellow"/>
           <w:vertAlign w:val="subscript"/>
         </w:rPr>
@@ -779,14 +817,18 @@
       </w:r>
       <w:r>
         <w:rPr>
-          <w:color w:val="FF0000"/>
+          <w:rFonts w:ascii="Cambria Math" w:hAnsi="Cambria Math" w:cs="Cambria Math" w:eastAsia="Cambria Math"/>
+          <w:color w:val="FF0000"/>
+          <w:sz w:val="18"/>
           <w:highlight w:val="yellow"/>
         </w:rPr>
         <w:t xml:space="preserve"> ∧ V</w:t>
       </w:r>
       <w:r>
         <w:rPr>
-          <w:color w:val="FF0000"/>
+          <w:rFonts w:ascii="Cambria Math" w:hAnsi="Cambria Math" w:cs="Cambria Math" w:eastAsia="Cambria Math"/>
+          <w:color w:val="FF0000"/>
+          <w:sz w:val="18"/>
           <w:highlight w:val="yellow"/>
           <w:vertAlign w:val="subscript"/>
         </w:rPr>
@@ -794,7 +836,9 @@
       </w:r>
       <w:r>
         <w:rPr>
-          <w:color w:val="FF0000"/>
+          <w:rFonts w:ascii="Cambria Math" w:hAnsi="Cambria Math" w:cs="Cambria Math" w:eastAsia="Cambria Math"/>
+          <w:color w:val="FF0000"/>
+          <w:sz w:val="18"/>
           <w:highlight w:val="yellow"/>
         </w:rPr>
         <w:t>) ⟹ Decision(C, R, t) = DENY.</w:t>

</xml_diff>

<commit_message>
Thesis Chapter 5: technology list rewritten (blockchain, Solidity, Python and Streamlit, DIDs and VCs, Synthea)
Co-Authored-By: Claude Fable 5.1 <noreply@anthropic.com>
Claude-Session: https://claude.ai/code/session_01QHSSv245Aernyaebt7V5kS
</commit_message>
<xml_diff>
--- a/docs/Yasir_Thesis_Chapter5.docx
+++ b/docs/Yasir_Thesis_Chapter5.docx
@@ -127,7 +127,7 @@
         <w:rPr>
           <w:color w:val="FF0000"/>
         </w:rPr>
-        <w:t>A blockchain is a decentralised and distributed ledger that records transactions across many computers so that a recorded entry cannot be altered retroactively without altering the blocks that follow it (Wood 2014). In this research, the Ethereum test network Sepolia (Ethereum Foundation 2026b) is used to anchor the state of an approved consent as a soulbound token (Cai 2022) and to record its revocation.</w:t>
+        <w:t>A blockchain is a decentralised and distributed ledger in which a recorded entry cannot be altered retroactively without altering the blocks that follow it (Wood 2014). In HALAH the chain holds no medical content; it anchors only the state of an approved consent, as a soulbound token (Cai 2022) that cannot be transferred, and its revocation. The Ethereum test network Sepolia (Ethereum Foundation 2026b) was chosen because it runs the same virtual machine as the main network, so the contract behaves as it would in production, while its ether has no monetary value. The contract was deployed and its transactions sent through the MetaMask wallet (Consensys 2026), and every transaction is publicly visible on Etherscan.</w:t>
       </w:r>
     </w:p>
     <w:p>
@@ -156,7 +156,7 @@
         <w:rPr>
           <w:color w:val="FF0000"/>
         </w:rPr>
-        <w:t>The consent contract is written in Solidity, the contract language of Ethereum (Ethereum Foundation 2026a), and was deployed to Sepolia with the Remix environment (Ethereum Foundation 2026c). The contract stores the start time, the expiry time and the revocation flag of each consent and reports whether the consent is valid at a given time.</w:t>
+        <w:t>The consent contract ConsentSBTv3 is written in Solidity, the contract language of Ethereum (Ethereum Foundation 2026a), on the OpenZeppelin implementation of the ERC-721 token standard (Entriken et al. 2018) with the ERC-5484 soulbound interface (Cai 2022), and was compiled in the Remix environment (Ethereum Foundation 2026c). The contract stores the start time, the expiry time and the revocation flag of each consent and reports whether the consent is valid at a given time, so the temporal and lifecycle conditions of Req 5 can be checked against the chain by any party, independently of the application.</w:t>
       </w:r>
     </w:p>
     <w:p>
@@ -185,7 +185,7 @@
         <w:rPr>
           <w:color w:val="FF0000"/>
         </w:rPr>
-        <w:t>The Controller and the four role interfaces of the prototype, for the patient, the guardian, the doctor and the auditor, are written in Python. The interfaces use the Streamlit library, and the application talks to Sepolia through the web3 library. Consents, approvals, decisions and the audit ledger are kept in a local SQLite database.</w:t>
+        <w:t>The Controller and the four role interfaces of the prototype, for the patient, the guardian, the doctor and the auditor, are written in Python with the Streamlit library, and the application reaches Sepolia through the web3 library. Consents, approvals, decisions and the audit ledger are kept in a local SQLite database, so the auditor can query the evidence of every decision while nothing but the consent state goes to the chain.</w:t>
       </w:r>
     </w:p>
     <w:p>
@@ -208,13 +208,13 @@
           <w:b/>
           <w:color w:val="FF0000"/>
         </w:rPr>
-        <w:t xml:space="preserve">EIP-712 and Groth16: </w:t>
-      </w:r>
-      <w:r>
-        <w:rPr>
-          <w:color w:val="FF0000"/>
-        </w:rPr>
-        <w:t>Each guardian approval is a typed-data signature under EIP-712 (Bloemen, Logvinov &amp; Evans 2017), so an approval is bound to one consent, one guardian and one network. The zero-knowledge proof that a consent has not expired is written in circom (iden3 2026b) and is generated and verified with snarkjs (iden3 2026a) under the Groth16 scheme (Groth 2016).</w:t>
+        <w:t xml:space="preserve">Decentralised identifiers and verifiable credentials: </w:t>
+      </w:r>
+      <w:r>
+        <w:rPr>
+          <w:color w:val="FF0000"/>
+        </w:rPr>
+        <w:t>Every participant is named by a decentralised identifier (W3C 2022) and holds a role credential (W3C 2025) signed by a trusted issuer, so the identity of a participant and the authority of that participant are verified as two separate conditions, as Chapter 6 presents.</w:t>
       </w:r>
     </w:p>
     <w:p>

</xml_diff>

<commit_message>
Thesis Chapter 5: proof-scheme mentions removed from the model chapter (kept for Chapter 8)
Co-Authored-By: Claude Fable 5.1 <noreply@anthropic.com>
Claude-Session: https://claude.ai/code/session_01QHSSv245Aernyaebt7V5kS
</commit_message>
<xml_diff>
--- a/docs/Yasir_Thesis_Chapter5.docx
+++ b/docs/Yasir_Thesis_Chapter5.docx
@@ -452,7 +452,17 @@
         <w:jc w:val="both"/>
       </w:pPr>
       <w:r>
-        <w:t xml:space="preserve">In the implemented prototype, the Controller comprises eight principal functions rather than six, since a zero-knowledge (ZK) Proof Service generates and verifies the Groth16 proof that feeds the Authorisation Decision, and an On-chain Anchor Service anchors the Sepolia mint as a background process. A revoke transaction is sent when the patient revokes a consent, and the patient view waits for its confirmation. The Model correspondingly contains the ConsentSBTv3 soulbound contract deployed on Sepolia together with the application audit ledger, both of which an independent verification tool reads, </w:t>
+        <w:t xml:space="preserve">In the implemented prototype, the Controller comprises eight principal functions rather than six, </w:t>
+      </w:r>
+      <w:r>
+        <w:rPr>
+          <w:color w:val="FF0000"/>
+          <w:highlight w:val="yellow"/>
+        </w:rPr>
+        <w:t>since a Validity Proof Service checks the consent once more before any data are released, as Chapter 8 presents, and an On-chain Anchor Service</w:t>
+      </w:r>
+      <w:r>
+        <w:t xml:space="preserve"> anchors the Sepolia mint as a background process. A revoke transaction is sent when the patient revokes a consent, and the patient view waits for its confirmation. The Model correspondingly contains the ConsentSBTv3 soulbound contract deployed on Sepolia together with the application audit ledger, both of which an independent verification tool reads, </w:t>
       </w:r>
       <w:r>
         <w:rPr>
@@ -920,9 +930,17 @@
         <w:jc w:val="both"/>
       </w:pPr>
       <w:r>
-        <w:t xml:space="preserve">If any required predicate evaluates to false, the decision is DENY. The Controller does not itself create these trust conditions. Instead, it evaluates evidence represented by the Model and coordinates the resulting decision. For the interpretation of the architecture: the Controller is a decision-enforcement mechanism, whereas the Model is a representation of trust and governance state. Both successful and unsuccessful decisions are subsequently associated with authorisation evidence, which supports accountability and subsequent verification. The layered architecture also establishes explicit trust boundaries. The View is considered an interaction boundary and therefore cannot be treated as a trusted source of authorisation decisions. The Controller represents the security enforcement boundary. It is responsible for applying the authorisation rules consistently and for preventing direct access to protected healthcare data when the required trust conditions are not satisfied. The Model represents the security-state boundary. Its records provide the evidence and state required for authorisation evaluation, but stored state alone does not constitute permission. In particular, the presence of a consent record, credential, or approval record cannot independently produce an access decision. The protected healthcare data represent the final resource boundary, and access is permitted only through the authorisation path enforced by the Controller. The proposed framework does not claim that MVC itself provides security. Instead, security arises from the explicit placement of trust-sensitive operations within the Controller, the structured representation of security state within the Model, and the prevention of direct security </w:t>
-        <w:lastRenderedPageBreak/>
-        <w:t>decisions at the View layer. In the present prototype, the Controller is a single trusted server that both evaluates the predicates and writes the audit ledger, and accordingly, the on-chain anchoring of consent state and the independent verification tool provide the external evidence against which the Controller's own records can be checked. Figure 5.4 puts the same conditions in the order a request meets them. A DID answers who is asking, a verifiable credential and a signed approval answer what that participant may do, the threshold answers whether the members of G agreed, and the policy, temporal and lifecycle checks with the zero-knowledge proof answer whether the consent is still valid for this request. The figure also states, gate by gate, what the current prototype checks, so the reader can see where the design and the prototype differ before the detailed sections.</w:t>
+        <w:t xml:space="preserve">If any required predicate evaluates to false, the decision is DENY. The Controller does not itself create these trust conditions. Instead, it evaluates evidence represented by the Model and coordinates the resulting decision. For the interpretation of the architecture: the Controller is a decision-enforcement mechanism, whereas the Model is a representation of trust and governance state. Both successful and unsuccessful decisions are subsequently associated with authorisation evidence, which supports accountability and subsequent verification. The layered architecture also establishes explicit trust boundaries. The View is considered an interaction boundary and therefore cannot be treated as a trusted source of authorisation decisions. The Controller represents the security enforcement boundary. It is responsible for applying the authorisation rules consistently and for preventing direct access to protected healthcare data when the required trust conditions are not satisfied. The Model represents the security-state boundary. Its records provide the evidence and state required for authorisation evaluation, but stored state alone does not constitute permission. In particular, the presence of a consent record, credential, or approval record cannot independently produce an access decision. The protected healthcare data represent the final resource boundary, and access is permitted only through the authorisation path enforced by the Controller. The proposed framework does not claim that MVC itself provides security. Instead, security arises from the explicit placement of trust-sensitive operations within the Controller, the structured representation of security state within the Model, and the prevention of direct security decisions at the View layer. In the present prototype, the Controller is a single trusted server that both evaluates the predicates and writes the audit ledger, and accordingly, the on-chain anchoring of consent state and the independent verification tool provide the external evidence against which the Controller's own records can be checked. Figure 5.4 puts the same conditions in the order a request meets them. A DID answers who is asking, a verifiable credential and a signed approval answer what that participant may do, the threshold answers whether the members of G agreed, and </w:t>
+      </w:r>
+      <w:r>
+        <w:rPr>
+          <w:color w:val="FF0000"/>
+          <w:highlight w:val="yellow"/>
+        </w:rPr>
+        <w:t>the policy, temporal and lifecycle checks answer</w:t>
+      </w:r>
+      <w:r>
+        <w:t xml:space="preserve"> whether the consent is still valid for this request. The figure also states, gate by gate, what the current prototype checks, so the reader can see where the design and the prototype differ before the detailed sections.</w:t>
       </w:r>
     </w:p>
     <w:p>
@@ -2765,11 +2783,12 @@
             <w:r>
               <w:rPr>
                 <w:rFonts w:ascii="Palatino Linotype" w:hAnsi="Palatino Linotype" w:cs="Palatino Linotype"/>
-                <w:color w:val="000000"/>
+                <w:color w:val="FF0000"/>
                 <w:sz w:val="20"/>
                 <w:szCs w:val="17"/>
-              </w:rPr>
-              <w:t>VI ∧ VA ∧ VP ∧ VT ∧ VL, plus a Groth16 proof before data is released</w:t>
+                <w:highlight w:val="yellow"/>
+              </w:rPr>
+              <w:t>VI ∧ VA ∧ VP ∧ VT ∧ VL, evaluated at every request</w:t>
             </w:r>
           </w:p>
         </w:tc>

</xml_diff>

<commit_message>
Thesis Chapter 5: Figure 5.4 redrawn to match Equation 5.1; Table 5.4 identity wording and step references corrected
Co-Authored-By: Claude Fable 5.1 <noreply@anthropic.com>
Claude-Session: https://claude.ai/code/session_01QHSSv245Aernyaebt7V5kS
</commit_message>
<xml_diff>
--- a/docs/Yasir_Thesis_Chapter5.docx
+++ b/docs/Yasir_Thesis_Chapter5.docx
@@ -945,46 +945,35 @@
     </w:p>
     <w:p>
       <w:pPr>
-        <w:keepNext/>
-        <w:spacing w:before="160" w:after="60"/>
         <w:jc w:val="center"/>
       </w:pPr>
       <w:r>
-        <w:rPr>
-          <w:noProof/>
-        </w:rPr>
         <w:drawing>
-          <wp:inline distT="0" distB="0" distL="0" distR="0" wp14:anchorId="363ECF6C" wp14:editId="22A82C44">
-            <wp:extent cx="5715000" cy="5000625"/>
-            <wp:effectExtent l="0" t="0" r="0" b="0"/>
-            <wp:docPr id="510887197" name="F44_slide.png" descr="The four gates that an access request passes before data are released: identity (DID), authority (VC and signed approval), collective approval (threshold), and validity of the consent for the request (policy, time, lifecycle and the zero-knowledge proof). Each gate names what the current prototype checks, and a failure at any gate produces DENY. The prototype records the decision matrix in the audit ledger for every request, including one against a consent that is not ACTIVE" title="The four gates that an access request passes before data are released: identity (DID), authority (VC and signed approval), collective approval (threshold), and validity of the consent for the request (policy, time, lifecycle and the zero-knowledge proof). Each gate names what the current prototype checks, and a failure at any gate produces DENY. The prototype records the decision matrix in the audit ledger for every request, including one against a consent that is not ACTIVE"/>
+          <wp:inline xmlns:a="http://schemas.openxmlformats.org/drawingml/2006/main" xmlns:pic="http://schemas.openxmlformats.org/drawingml/2006/picture">
+            <wp:extent cx="5400000" cy="3436780"/>
+            <wp:docPr id="2086885383" name="Picture 2086885383"/>
             <wp:cNvGraphicFramePr>
-              <a:graphicFrameLocks xmlns:a="http://schemas.openxmlformats.org/drawingml/2006/main" noChangeAspect="1"/>
+              <a:graphicFrameLocks noChangeAspect="1"/>
             </wp:cNvGraphicFramePr>
-            <a:graphic xmlns:a="http://schemas.openxmlformats.org/drawingml/2006/main">
+            <a:graphic>
               <a:graphicData uri="http://schemas.openxmlformats.org/drawingml/2006/picture">
-                <pic:pic xmlns:pic="http://schemas.openxmlformats.org/drawingml/2006/picture">
+                <pic:pic>
                   <pic:nvPicPr>
-                    <pic:cNvPr id="0" name=""/>
-                    <pic:cNvPicPr>
-                      <a:picLocks noChangeAspect="1" noChangeArrowheads="1"/>
-                    </pic:cNvPicPr>
+                    <pic:cNvPr id="0" name="ch5_gates.png"/>
+                    <pic:cNvPicPr/>
                   </pic:nvPicPr>
                   <pic:blipFill>
-                    <a:blip r:embed="rId12"/>
-                    <a:srcRect/>
+                    <a:blip r:embed="rId37"/>
                     <a:stretch>
                       <a:fillRect/>
                     </a:stretch>
                   </pic:blipFill>
-                  <pic:spPr bwMode="auto">
+                  <pic:spPr>
                     <a:xfrm>
                       <a:off x="0" y="0"/>
-                      <a:ext cx="5715000" cy="5000625"/>
+                      <a:ext cx="5400000" cy="3436780"/>
                     </a:xfrm>
-                    <a:prstGeom prst="rect">
-                      <a:avLst/>
-                    </a:prstGeom>
+                    <a:prstGeom prst="rect"/>
                   </pic:spPr>
                 </pic:pic>
               </a:graphicData>
@@ -5606,7 +5595,7 @@
         <w:drawing>
           <wp:inline xmlns:a="http://schemas.openxmlformats.org/drawingml/2006/main" xmlns:pic="http://schemas.openxmlformats.org/drawingml/2006/picture">
             <wp:extent cx="4860000" cy="3645000"/>
-            <wp:docPr id="2086885383" name="Picture 2086885383"/>
+            <wp:docPr id="2086885384" name="Picture 2086885384"/>
             <wp:cNvGraphicFramePr>
               <a:graphicFrameLocks noChangeAspect="1"/>
             </wp:cNvGraphicFramePr>
@@ -5618,7 +5607,7 @@
                     <pic:cNvPicPr/>
                   </pic:nvPicPr>
                   <pic:blipFill>
-                    <a:blip r:embed="rId37"/>
+                    <a:blip r:embed="rId38"/>
                     <a:stretch>
                       <a:fillRect/>
                     </a:stretch>
@@ -5718,7 +5707,7 @@
         <w:drawing>
           <wp:inline xmlns:a="http://schemas.openxmlformats.org/drawingml/2006/main" xmlns:pic="http://schemas.openxmlformats.org/drawingml/2006/picture">
             <wp:extent cx="4860000" cy="2930294"/>
-            <wp:docPr id="2086885384" name="Picture 2086885384"/>
+            <wp:docPr id="2086885385" name="Picture 2086885385"/>
             <wp:cNvGraphicFramePr>
               <a:graphicFrameLocks noChangeAspect="1"/>
             </wp:cNvGraphicFramePr>
@@ -5730,7 +5719,7 @@
                     <pic:cNvPicPr/>
                   </pic:nvPicPr>
                   <pic:blipFill>
-                    <a:blip r:embed="rId38"/>
+                    <a:blip r:embed="rId39"/>
                     <a:stretch>
                       <a:fillRect/>
                     </a:stretch>
@@ -6113,8 +6102,9 @@
                 <w:rFonts w:ascii="Palatino Linotype" w:hAnsi="Palatino Linotype" w:cs="Palatino Linotype"/>
                 <w:color w:val="FF0000"/>
                 <w:sz w:val="20"/>
-              </w:rPr>
-              <w:t>Invalid identities rejected before anything is stored; valid identities accepted.</w:t>
+                <w:highlight w:val="yellow"/>
+              </w:rPr>
+              <w:t>Identifiers without a valid credential rejected before anything is stored; valid identifiers holding valid credentials accepted.</w:t>
             </w:r>
           </w:p>
         </w:tc>
@@ -6190,8 +6180,9 @@
                 <w:rFonts w:ascii="Palatino Linotype" w:hAnsi="Palatino Linotype" w:cs="Palatino Linotype"/>
                 <w:color w:val="FF0000"/>
                 <w:sz w:val="20"/>
-              </w:rPr>
-              <w:t>Step 3: the guardian set G and the threshold N; no guardian may appear twice.</w:t>
+                <w:highlight w:val="yellow"/>
+              </w:rPr>
+              <w:t>Steps 3 and 7: the guardian set G, and the threshold N derived from it as |G|; no guardian may appear twice.</w:t>
             </w:r>
           </w:p>
         </w:tc>
@@ -6637,8 +6628,9 @@
                 <w:rFonts w:ascii="Palatino Linotype" w:hAnsi="Palatino Linotype" w:cs="Palatino Linotype"/>
                 <w:color w:val="FF0000"/>
                 <w:sz w:val="20"/>
-              </w:rPr>
-              <w:t>Steps 8 and 9: the consent identifier is generated and the object is created in the state PENDING_SIGNATURE.</w:t>
+                <w:highlight w:val="yellow"/>
+              </w:rPr>
+              <w:t>Steps 8 to 10: the consent identifier is generated, the object is constructed and persisted, and its state becomes PENDING_SIGNATURE.</w:t>
             </w:r>
           </w:p>
         </w:tc>
@@ -7814,10 +7806,10 @@
       </w:r>
     </w:p>
     <w:sectPr>
-      <w:headerReference w:type="default" r:id="rId39"/>
-      <w:headerReference w:type="even" r:id="rId40"/>
+      <w:headerReference w:type="default" r:id="rId40"/>
+      <w:headerReference w:type="even" r:id="rId41"/>
       <w:footerReference w:type="default" r:id="rId34"/>
-      <w:footerReference w:type="even" r:id="rId41"/>
+      <w:footerReference w:type="even" r:id="rId42"/>
       <w:pgSz w:w="11906" w:h="16838"/>
       <w:pgMar w:top="1417" w:right="1701" w:bottom="1417" w:left="1701" w:header="737" w:footer="737" w:gutter="0"/>
       <w:cols w:space="720"/>

</xml_diff>